<commit_message>
add doc, MAJ Code
</commit_message>
<xml_diff>
--- a/DOC/SAE_ROUE_2024_2025_FRANCES_CIAMPI.docx
+++ b/DOC/SAE_ROUE_2024_2025_FRANCES_CIAMPI.docx
@@ -10,7 +10,6 @@
           <w:docPartUnique/>
         </w:docPartObj>
       </w:sdtPr>
-      <w:sdtEndPr/>
       <w:sdtContent>
         <w:tbl>
           <w:tblPr>
@@ -366,12 +365,14 @@
                   </w:rPr>
                   <w:t xml:space="preserve"> </w:t>
                 </w:r>
+                <w:proofErr w:type="spellStart"/>
                 <w:r>
                   <w:rPr>
                     <w:color w:val="2E74B5" w:themeColor="accent1" w:themeShade="BF"/>
                   </w:rPr>
                   <w:t>Brushless</w:t>
                 </w:r>
+                <w:proofErr w:type="spellEnd"/>
               </w:p>
               <w:p>
                 <w:pPr>
@@ -420,6 +421,7 @@
                   </w:rPr>
                   <w:t xml:space="preserve">Savoir gérer une liaison </w:t>
                 </w:r>
+                <w:proofErr w:type="gramStart"/>
                 <w:r>
                   <w:rPr>
                     <w:color w:val="2E74B5" w:themeColor="accent1" w:themeShade="BF"/>
@@ -430,7 +432,14 @@
                   <w:rPr>
                     <w:color w:val="2E74B5" w:themeColor="accent1" w:themeShade="BF"/>
                   </w:rPr>
-                  <w:t xml:space="preserve"> entre un PC et un µ</w:t>
+                  <w:t xml:space="preserve"> entre</w:t>
+                </w:r>
+                <w:proofErr w:type="gramEnd"/>
+                <w:r>
+                  <w:rPr>
+                    <w:color w:val="2E74B5" w:themeColor="accent1" w:themeShade="BF"/>
+                  </w:rPr>
+                  <w:t xml:space="preserve"> un PC et un µ</w:t>
                 </w:r>
                 <w:r>
                   <w:rPr>
@@ -555,7 +564,15 @@
         <w:t xml:space="preserve">en VHDL </w:t>
       </w:r>
       <w:r>
-        <w:t>d’un PLD Altera pour réaliser la commande du collecteur électronique du moteur de VAE</w:t>
+        <w:t xml:space="preserve">d’un PLD </w:t>
+      </w:r>
+      <w:proofErr w:type="spellStart"/>
+      <w:r>
+        <w:t>Altera</w:t>
+      </w:r>
+      <w:proofErr w:type="spellEnd"/>
+      <w:r>
+        <w:t xml:space="preserve"> pour réaliser la commande du collecteur électronique du moteur de VAE</w:t>
       </w:r>
     </w:p>
     <w:p>
@@ -580,11 +597,16 @@
         </w:numPr>
       </w:pPr>
       <w:r>
-        <w:t xml:space="preserve">La mise en place d’un serveur web et d’une application mobile pour  </w:t>
+        <w:t xml:space="preserve">La mise en place d’un serveur web et d’une application mobile </w:t>
+      </w:r>
+      <w:proofErr w:type="gramStart"/>
+      <w:r>
+        <w:t xml:space="preserve">pour  </w:t>
       </w:r>
       <w:r>
         <w:t>l’affichage</w:t>
       </w:r>
+      <w:proofErr w:type="gramEnd"/>
       <w:r>
         <w:t xml:space="preserve"> des paramètres instantanés du contrôleur de VAE (vitesse, % assistance, jauge énergie, température convertisseur, courant </w:t>
       </w:r>
@@ -773,36 +795,29 @@
               <w:ind w:firstLine="0"/>
               <w:rPr>
                 <w:noProof/>
-                <w:lang w:val="en-US" w:eastAsia="fr-FR"/>
+                <w:lang w:eastAsia="fr-FR"/>
               </w:rPr>
             </w:pPr>
             <w:r>
               <w:rPr>
                 <w:noProof/>
-                <w:lang w:val="en-US" w:eastAsia="fr-FR"/>
+                <w:lang w:eastAsia="fr-FR"/>
               </w:rPr>
               <w:t>Moteur brushl</w:t>
             </w:r>
             <w:r>
               <w:rPr>
                 <w:noProof/>
-                <w:lang w:val="en-US" w:eastAsia="fr-FR"/>
+                <w:lang w:eastAsia="fr-FR"/>
               </w:rPr>
               <w:t>ess</w:t>
             </w:r>
             <w:r>
               <w:rPr>
                 <w:noProof/>
-                <w:lang w:val="en-US" w:eastAsia="fr-FR"/>
-              </w:rPr>
-              <w:t xml:space="preserve"> 48V 250W (vélo) ou 650W(s</w:t>
-            </w:r>
-            <w:r>
-              <w:rPr>
-                <w:noProof/>
-                <w:lang w:val="en-US" w:eastAsia="fr-FR"/>
-              </w:rPr>
-              <w:t>cooter)</w:t>
+                <w:lang w:eastAsia="fr-FR"/>
+              </w:rPr>
+              <w:t xml:space="preserve"> 48V 250W (vélo) ou 650W(scooter)</w:t>
             </w:r>
           </w:p>
           <w:p>
@@ -1115,7 +1130,15 @@
         <w:jc w:val="left"/>
       </w:pPr>
       <w:r>
-        <w:t>Assurer l’autopilotage temps réel du moteur brushless à partir de la connaissance de sa position rotorique (</w:t>
+        <w:t xml:space="preserve">Assurer l’autopilotage temps réel du moteur </w:t>
+      </w:r>
+      <w:proofErr w:type="spellStart"/>
+      <w:r>
+        <w:t>brushless</w:t>
+      </w:r>
+      <w:proofErr w:type="spellEnd"/>
+      <w:r>
+        <w:t xml:space="preserve"> à partir de la connaissance de sa position rotorique (</w:t>
       </w:r>
       <w:r>
         <w:t xml:space="preserve">à laides des informations booléennes des </w:t>
@@ -1156,10 +1179,18 @@
         <w:t>de</w:t>
       </w:r>
       <w:r>
-        <w:t xml:space="preserve"> la position angulaire </w:t>
-      </w:r>
-      <w:r>
-        <w:t xml:space="preserve"> la poignée de gaz/capteur de pédalage de manière instantanée ou progressive (lissage des variations de consigne</w:t>
+        <w:t xml:space="preserve"> la position </w:t>
+      </w:r>
+      <w:proofErr w:type="gramStart"/>
+      <w:r>
+        <w:t xml:space="preserve">angulaire </w:t>
+      </w:r>
+      <w:r>
+        <w:t xml:space="preserve"> la</w:t>
+      </w:r>
+      <w:proofErr w:type="gramEnd"/>
+      <w:r>
+        <w:t xml:space="preserve"> poignée de gaz/capteur de pédalage de manière instantanée ou progressive (lissage des variations de consigne</w:t>
       </w:r>
       <w:r>
         <w:t xml:space="preserve"> de poignée de gaz</w:t>
@@ -1178,11 +1209,16 @@
         <w:spacing w:after="0" w:line="240" w:lineRule="auto"/>
         <w:jc w:val="left"/>
       </w:pPr>
+      <w:proofErr w:type="gramStart"/>
       <w:r>
         <w:t xml:space="preserve">Mesurer </w:t>
       </w:r>
       <w:r>
-        <w:t xml:space="preserve"> la mesure de vitesse de rotation du moteur en m/h (0 à 60000m/h)</w:t>
+        <w:t xml:space="preserve"> la</w:t>
+      </w:r>
+      <w:proofErr w:type="gramEnd"/>
+      <w:r>
+        <w:t xml:space="preserve"> mesure de vitesse de rotation du moteur en m/h (0 à 60000m/h)</w:t>
       </w:r>
     </w:p>
     <w:p>
@@ -1199,7 +1235,15 @@
         <w:t>Gérer le capteur de freinage (fonctionnement non réversible en énergie)</w:t>
       </w:r>
       <w:r>
-        <w:t xml:space="preserve"> pour piloter l’assistance electrique.</w:t>
+        <w:t xml:space="preserve"> pour piloter l’assistance </w:t>
+      </w:r>
+      <w:proofErr w:type="spellStart"/>
+      <w:r>
+        <w:t>electrique</w:t>
+      </w:r>
+      <w:proofErr w:type="spellEnd"/>
+      <w:r>
+        <w:t>.</w:t>
       </w:r>
     </w:p>
     <w:p>
@@ -1216,8 +1260,13 @@
         <w:t>Gérer la calibration persistante de la poignée de gaz</w:t>
       </w:r>
       <w:r>
-        <w:t xml:space="preserve"> avec une sauvegarde dans un fichier texte sur le Mbed</w:t>
-      </w:r>
+        <w:t xml:space="preserve"> avec une sauvegarde dans un fichier texte sur le </w:t>
+      </w:r>
+      <w:proofErr w:type="spellStart"/>
+      <w:r>
+        <w:t>Mbed</w:t>
+      </w:r>
+      <w:proofErr w:type="spellEnd"/>
     </w:p>
     <w:p>
       <w:pPr>
@@ -1322,12 +1371,14 @@
         <w:t xml:space="preserve"> collecter les informations servies en http par le microcontrôleur central (utilisation de </w:t>
       </w:r>
       <w:hyperlink r:id="rId12" w:history="1">
+        <w:proofErr w:type="spellStart"/>
         <w:r>
           <w:rPr>
             <w:rStyle w:val="Lienhypertexte"/>
           </w:rPr>
           <w:t>appinventor</w:t>
         </w:r>
+        <w:proofErr w:type="spellEnd"/>
       </w:hyperlink>
       <w:r>
         <w:t>)</w:t>
@@ -1344,7 +1395,23 @@
         <w:jc w:val="left"/>
       </w:pPr>
       <w:r>
-        <w:t>Proposer de déporter la gestion de la consigne d’assistance au pédalage  et de freinage via un réseau CAN BUS. La poignée sera alors connectée depuis un 2eme microcontrôleur relié en BUS Can au contrôleur de puissance (réalisation d’un capteur  intelligent et communiquant).</w:t>
+        <w:t xml:space="preserve">Proposer de déporter la gestion de la consigne d’assistance au </w:t>
+      </w:r>
+      <w:proofErr w:type="gramStart"/>
+      <w:r>
+        <w:t>pédalage  et</w:t>
+      </w:r>
+      <w:proofErr w:type="gramEnd"/>
+      <w:r>
+        <w:t xml:space="preserve"> de freinage via un réseau CAN BUS. La poignée sera alors connectée depuis un 2eme microcontrôleur relié en BUS Can au contrôleur de puissance (réalisation d’un </w:t>
+      </w:r>
+      <w:proofErr w:type="gramStart"/>
+      <w:r>
+        <w:t>capteur  intelligent</w:t>
+      </w:r>
+      <w:proofErr w:type="gramEnd"/>
+      <w:r>
+        <w:t xml:space="preserve"> et communiquant).</w:t>
       </w:r>
     </w:p>
     <w:p/>
@@ -1443,7 +1510,23 @@
         <w:t>s</w:t>
       </w:r>
       <w:r>
-        <w:t xml:space="preserve"> en regardant  la fiche  ressource  disponible sur LMS UNICE dans le cours « SAE ROUE » à savoir la fiche 0 :</w:t>
+        <w:t xml:space="preserve"> en </w:t>
+      </w:r>
+      <w:proofErr w:type="gramStart"/>
+      <w:r>
+        <w:t>regardant  la</w:t>
+      </w:r>
+      <w:proofErr w:type="gramEnd"/>
+      <w:r>
+        <w:t xml:space="preserve"> </w:t>
+      </w:r>
+      <w:proofErr w:type="gramStart"/>
+      <w:r>
+        <w:t>fiche  ressource</w:t>
+      </w:r>
+      <w:proofErr w:type="gramEnd"/>
+      <w:r>
+        <w:t xml:space="preserve">  disponible sur LMS UNICE dans le cours « SAE ROUE » à savoir la fiche 0 :</w:t>
       </w:r>
     </w:p>
     <w:p>
@@ -1476,7 +1559,15 @@
         <w:t xml:space="preserve"> présenté en figure 1, </w:t>
       </w:r>
       <w:r>
-        <w:t xml:space="preserve"> nous avons  un </w:t>
+        <w:t xml:space="preserve"> nous </w:t>
+      </w:r>
+      <w:proofErr w:type="gramStart"/>
+      <w:r>
+        <w:t>avons  un</w:t>
+      </w:r>
+      <w:proofErr w:type="gramEnd"/>
+      <w:r>
+        <w:t xml:space="preserve"> </w:t>
       </w:r>
       <w:r>
         <w:t>contrôleur</w:t>
@@ -1503,8 +1594,13 @@
         <w:t xml:space="preserve"> </w:t>
       </w:r>
       <w:r>
-        <w:t>du moteur brushless</w:t>
-      </w:r>
+        <w:t xml:space="preserve">du moteur </w:t>
+      </w:r>
+      <w:proofErr w:type="spellStart"/>
+      <w:r>
+        <w:t>brushless</w:t>
+      </w:r>
+      <w:proofErr w:type="spellEnd"/>
       <w:r>
         <w:t xml:space="preserve"> afin d’assurer l’alimentation des phases de l’induit en fonction de la position angulaire de l’inducteur.</w:t>
       </w:r>
@@ -1539,7 +1635,15 @@
         <w:t xml:space="preserve"> capteurs </w:t>
       </w:r>
       <w:r>
-        <w:t>freinage (break), sur intensité (overcurrent), défaillance (FLT</w:t>
+        <w:t>freinage (break), sur intensité (</w:t>
+      </w:r>
+      <w:proofErr w:type="spellStart"/>
+      <w:r>
+        <w:t>overcurrent</w:t>
+      </w:r>
+      <w:proofErr w:type="spellEnd"/>
+      <w:r>
+        <w:t>), défaillance (FLT</w:t>
       </w:r>
       <w:r>
         <w:t>A</w:t>
@@ -1563,7 +1667,23 @@
         <w:t xml:space="preserve">présent dans le </w:t>
       </w:r>
       <w:r>
-        <w:t xml:space="preserve">convertisseur, tension de la batterie et courant délivré par la batterie. Il aura donc un rôle de superviseur non temps réel de l’autopilotage et fournira à </w:t>
+        <w:t xml:space="preserve">convertisseur, tension de la batterie et courant délivré par la batterie. Il </w:t>
+      </w:r>
+      <w:proofErr w:type="gramStart"/>
+      <w:r>
+        <w:t>aura</w:t>
+      </w:r>
+      <w:proofErr w:type="gramEnd"/>
+      <w:r>
+        <w:t xml:space="preserve"> donc un rôle de superviseur </w:t>
+      </w:r>
+      <w:proofErr w:type="gramStart"/>
+      <w:r>
+        <w:t>non temps</w:t>
+      </w:r>
+      <w:proofErr w:type="gramEnd"/>
+      <w:r>
+        <w:t xml:space="preserve"> réel de l’autopilotage et fournira à </w:t>
       </w:r>
       <w:r>
         <w:t>l’utilisateur</w:t>
@@ -1619,11 +1739,16 @@
       <w:r>
         <w:t xml:space="preserve"> de VAE (indicateur de vitesse, autonomie batterie, puissance poignée de gaz, </w:t>
       </w:r>
+      <w:proofErr w:type="gramStart"/>
       <w:r>
         <w:t>odomètre</w:t>
       </w:r>
       <w:r>
-        <w:t>….)</w:t>
+        <w:t>….</w:t>
+      </w:r>
+      <w:proofErr w:type="gramEnd"/>
+      <w:r>
+        <w:t>)</w:t>
       </w:r>
     </w:p>
     <w:p>
@@ -1637,7 +1762,15 @@
         <w:t xml:space="preserve"> de de DATA </w:t>
       </w:r>
       <w:r>
-        <w:t xml:space="preserve">en lecture et ecriture </w:t>
+        <w:t xml:space="preserve">en lecture et </w:t>
+      </w:r>
+      <w:proofErr w:type="spellStart"/>
+      <w:r>
+        <w:t>ecriture</w:t>
+      </w:r>
+      <w:proofErr w:type="spellEnd"/>
+      <w:r>
+        <w:t xml:space="preserve"> </w:t>
       </w:r>
       <w:r>
         <w:t>via une liaison // 8 bits bidirectionnelle</w:t>
@@ -1645,8 +1778,37 @@
     </w:p>
     <w:p>
       <w:r>
-        <w:t>Cet octet de  donnée échangé servira au uC MBED à transmettre vers le PLD Altera une consigne de tension de sortie de l’onduleur (Ref_PWM</w:t>
-      </w:r>
+        <w:t xml:space="preserve">Cet octet </w:t>
+      </w:r>
+      <w:proofErr w:type="gramStart"/>
+      <w:r>
+        <w:t>de  donnée</w:t>
+      </w:r>
+      <w:proofErr w:type="gramEnd"/>
+      <w:r>
+        <w:t xml:space="preserve"> échangé servira au </w:t>
+      </w:r>
+      <w:proofErr w:type="spellStart"/>
+      <w:r>
+        <w:t>uC</w:t>
+      </w:r>
+      <w:proofErr w:type="spellEnd"/>
+      <w:r>
+        <w:t xml:space="preserve"> MBED à transmettre vers le PLD </w:t>
+      </w:r>
+      <w:proofErr w:type="spellStart"/>
+      <w:r>
+        <w:t>Altera</w:t>
+      </w:r>
+      <w:proofErr w:type="spellEnd"/>
+      <w:r>
+        <w:t xml:space="preserve"> une consigne de tension de sortie de l’onduleur (</w:t>
+      </w:r>
+      <w:proofErr w:type="spellStart"/>
+      <w:r>
+        <w:t>Ref_PWM</w:t>
+      </w:r>
+      <w:proofErr w:type="spellEnd"/>
       <w:r>
         <w:t xml:space="preserve"> codée sur 8 bits</w:t>
       </w:r>
@@ -1677,6 +1839,7 @@
         <w:rPr>
           <w:noProof/>
         </w:rPr>
+        <w:lastRenderedPageBreak/>
         <w:drawing>
           <wp:inline distT="0" distB="0" distL="0" distR="0" wp14:anchorId="1DDDAF16" wp14:editId="2A494159">
             <wp:extent cx="6448425" cy="2533650"/>
@@ -1744,7 +1907,15 @@
         </w:r>
       </w:fldSimple>
       <w:r>
-        <w:t> : Contrôleur VAE programmable composé de deux cartes (PLD altera et MBEDLPC1768) pouvant communiquer entre elles grâce à un bus // de 8 bits de données</w:t>
+        <w:t xml:space="preserve"> : Contrôleur VAE programmable composé de deux cartes (PLD </w:t>
+      </w:r>
+      <w:proofErr w:type="spellStart"/>
+      <w:r>
+        <w:t>altera</w:t>
+      </w:r>
+      <w:proofErr w:type="spellEnd"/>
+      <w:r>
+        <w:t xml:space="preserve"> et MBEDLPC1768) pouvant communiquer entre elles grâce à un bus // de 8 bits de données</w:t>
       </w:r>
     </w:p>
     <w:p>
@@ -1906,7 +2077,23 @@
         <w:t xml:space="preserve"> </w:t>
       </w:r>
       <w:r>
-        <w:t>Il s’agit donc de pouvoir piloter le  moteur roue de technologie Brushless (moteur courant continu sans balais) en commande trapèze et en vitesse variable à partir d’un microcontrôleur MBED et d’un circuit logique programmable MAX7064SLC44-10.</w:t>
+        <w:t xml:space="preserve">Il s’agit donc de pouvoir piloter </w:t>
+      </w:r>
+      <w:proofErr w:type="gramStart"/>
+      <w:r>
+        <w:t>le  moteur</w:t>
+      </w:r>
+      <w:proofErr w:type="gramEnd"/>
+      <w:r>
+        <w:t xml:space="preserve"> roue de technologie </w:t>
+      </w:r>
+      <w:proofErr w:type="spellStart"/>
+      <w:r>
+        <w:t>Brushless</w:t>
+      </w:r>
+      <w:proofErr w:type="spellEnd"/>
+      <w:r>
+        <w:t xml:space="preserve"> (moteur courant continu sans balais) en commande trapèze et en vitesse variable à partir d’un microcontrôleur MBED et d’un circuit logique programmable MAX7064SLC44-10.</w:t>
       </w:r>
     </w:p>
     <w:p>
@@ -1916,7 +2103,15 @@
     </w:p>
     <w:p>
       <w:r>
-        <w:t>Le PLD altera sera chargé de l’autopilotage temps réel en vitesse variable du moteur (la boucle d’autopilotage visible sur la figure2 est en effet critique et présente des contraintes temps réel dures).</w:t>
+        <w:t xml:space="preserve">Le PLD </w:t>
+      </w:r>
+      <w:proofErr w:type="spellStart"/>
+      <w:r>
+        <w:t>altera</w:t>
+      </w:r>
+      <w:proofErr w:type="spellEnd"/>
+      <w:r>
+        <w:t xml:space="preserve"> sera chargé de l’autopilotage temps réel en vitesse variable du moteur (la boucle d’autopilotage visible sur la figure2 est en effet critique et présente des contraintes temps réel dures).</w:t>
       </w:r>
     </w:p>
     <w:p>
@@ -1933,8 +2128,14 @@
         <w:pStyle w:val="Titre2"/>
       </w:pPr>
       <w:r>
-        <w:t>Tableau et affectation générale des signaux échangés entre le MBED et le PLD Altera</w:t>
-      </w:r>
+        <w:lastRenderedPageBreak/>
+        <w:t xml:space="preserve">Tableau et affectation générale des signaux échangés entre le MBED et le PLD </w:t>
+      </w:r>
+      <w:proofErr w:type="spellStart"/>
+      <w:r>
+        <w:t>Altera</w:t>
+      </w:r>
+      <w:proofErr w:type="spellEnd"/>
     </w:p>
     <w:tbl>
       <w:tblPr>
@@ -1974,13 +2175,41 @@
                 <w:szCs w:val="18"/>
               </w:rPr>
             </w:pPr>
+            <w:proofErr w:type="gramStart"/>
             <w:r>
               <w:rPr>
                 <w:b/>
                 <w:sz w:val="18"/>
                 <w:szCs w:val="18"/>
               </w:rPr>
-              <w:t>Pin  sur PLD Altera.</w:t>
+              <w:t>Pin  sur</w:t>
+            </w:r>
+            <w:proofErr w:type="gramEnd"/>
+            <w:r>
+              <w:rPr>
+                <w:b/>
+                <w:sz w:val="18"/>
+                <w:szCs w:val="18"/>
+              </w:rPr>
+              <w:t xml:space="preserve"> PLD </w:t>
+            </w:r>
+            <w:proofErr w:type="spellStart"/>
+            <w:r>
+              <w:rPr>
+                <w:b/>
+                <w:sz w:val="18"/>
+                <w:szCs w:val="18"/>
+              </w:rPr>
+              <w:t>Altera</w:t>
+            </w:r>
+            <w:proofErr w:type="spellEnd"/>
+            <w:r>
+              <w:rPr>
+                <w:b/>
+                <w:sz w:val="18"/>
+                <w:szCs w:val="18"/>
+              </w:rPr>
+              <w:t>.</w:t>
             </w:r>
           </w:p>
         </w:tc>
@@ -2003,7 +2232,25 @@
                 <w:sz w:val="18"/>
                 <w:szCs w:val="18"/>
               </w:rPr>
-              <w:t>Broche connecteur HE10 50p  sur la carte MBED</w:t>
+              <w:t>Broche connecteur HE10 50</w:t>
+            </w:r>
+            <w:proofErr w:type="gramStart"/>
+            <w:r>
+              <w:rPr>
+                <w:b/>
+                <w:sz w:val="18"/>
+                <w:szCs w:val="18"/>
+              </w:rPr>
+              <w:t>p  sur</w:t>
+            </w:r>
+            <w:proofErr w:type="gramEnd"/>
+            <w:r>
+              <w:rPr>
+                <w:b/>
+                <w:sz w:val="18"/>
+                <w:szCs w:val="18"/>
+              </w:rPr>
+              <w:t xml:space="preserve"> la carte MBED</w:t>
             </w:r>
           </w:p>
         </w:tc>
@@ -2048,7 +2295,25 @@
                 <w:sz w:val="18"/>
                 <w:szCs w:val="18"/>
               </w:rPr>
-              <w:t xml:space="preserve">Broches sur  le MBED LPC1768 </w:t>
+              <w:t xml:space="preserve">Broches </w:t>
+            </w:r>
+            <w:proofErr w:type="gramStart"/>
+            <w:r>
+              <w:rPr>
+                <w:b/>
+                <w:sz w:val="18"/>
+                <w:szCs w:val="18"/>
+              </w:rPr>
+              <w:t>sur  le</w:t>
+            </w:r>
+            <w:proofErr w:type="gramEnd"/>
+            <w:r>
+              <w:rPr>
+                <w:b/>
+                <w:sz w:val="18"/>
+                <w:szCs w:val="18"/>
+              </w:rPr>
+              <w:t xml:space="preserve"> MBED LPC1768 </w:t>
             </w:r>
           </w:p>
         </w:tc>
@@ -2131,7 +2396,23 @@
                 <w:sz w:val="18"/>
                 <w:szCs w:val="18"/>
               </w:rPr>
-              <w:t>DATA_OUT[7..0]</w:t>
+              <w:t>DATA_OUT[</w:t>
+            </w:r>
+            <w:proofErr w:type="gramStart"/>
+            <w:r>
+              <w:rPr>
+                <w:sz w:val="18"/>
+                <w:szCs w:val="18"/>
+              </w:rPr>
+              <w:t>7..</w:t>
+            </w:r>
+            <w:proofErr w:type="gramEnd"/>
+            <w:r>
+              <w:rPr>
+                <w:sz w:val="18"/>
+                <w:szCs w:val="18"/>
+              </w:rPr>
+              <w:t>0]</w:t>
             </w:r>
           </w:p>
         </w:tc>
@@ -2154,7 +2435,35 @@
                 <w:szCs w:val="18"/>
                 <w:lang w:val="en-US"/>
               </w:rPr>
-              <w:t>[p24(msb),P23,P10,P9,P8</w:t>
+              <w:t>[p24(</w:t>
+            </w:r>
+            <w:proofErr w:type="spellStart"/>
+            <w:r>
+              <w:rPr>
+                <w:sz w:val="18"/>
+                <w:szCs w:val="18"/>
+                <w:lang w:val="en-US"/>
+              </w:rPr>
+              <w:t>msb</w:t>
+            </w:r>
+            <w:proofErr w:type="spellEnd"/>
+            <w:proofErr w:type="gramStart"/>
+            <w:r>
+              <w:rPr>
+                <w:sz w:val="18"/>
+                <w:szCs w:val="18"/>
+                <w:lang w:val="en-US"/>
+              </w:rPr>
+              <w:t>),P23,P10,P9,P</w:t>
+            </w:r>
+            <w:proofErr w:type="gramEnd"/>
+            <w:r>
+              <w:rPr>
+                <w:sz w:val="18"/>
+                <w:szCs w:val="18"/>
+                <w:lang w:val="en-US"/>
+              </w:rPr>
+              <w:t>8</w:t>
             </w:r>
           </w:p>
           <w:p>
@@ -2166,13 +2475,41 @@
                 <w:lang w:val="en-US"/>
               </w:rPr>
             </w:pPr>
+            <w:proofErr w:type="gramStart"/>
             <w:r>
               <w:rPr>
                 <w:sz w:val="18"/>
                 <w:szCs w:val="18"/>
                 <w:lang w:val="en-US"/>
               </w:rPr>
-              <w:t>,P7,P6,P5(lsb)]</w:t>
+              <w:t>,P7,P6,P</w:t>
+            </w:r>
+            <w:proofErr w:type="gramEnd"/>
+            <w:r>
+              <w:rPr>
+                <w:sz w:val="18"/>
+                <w:szCs w:val="18"/>
+                <w:lang w:val="en-US"/>
+              </w:rPr>
+              <w:t>5(</w:t>
+            </w:r>
+            <w:proofErr w:type="spellStart"/>
+            <w:r>
+              <w:rPr>
+                <w:sz w:val="18"/>
+                <w:szCs w:val="18"/>
+                <w:lang w:val="en-US"/>
+              </w:rPr>
+              <w:t>lsb</w:t>
+            </w:r>
+            <w:proofErr w:type="spellEnd"/>
+            <w:r>
+              <w:rPr>
+                <w:sz w:val="18"/>
+                <w:szCs w:val="18"/>
+                <w:lang w:val="en-US"/>
+              </w:rPr>
+              <w:t>)]</w:t>
             </w:r>
           </w:p>
         </w:tc>
@@ -2202,7 +2539,23 @@
                 <w:sz w:val="18"/>
                 <w:szCs w:val="18"/>
               </w:rPr>
-              <w:t>REF_PWM[7..0]</w:t>
+              <w:t>REF_PWM[</w:t>
+            </w:r>
+            <w:proofErr w:type="gramStart"/>
+            <w:r>
+              <w:rPr>
+                <w:sz w:val="18"/>
+                <w:szCs w:val="18"/>
+              </w:rPr>
+              <w:t>7..</w:t>
+            </w:r>
+            <w:proofErr w:type="gramEnd"/>
+            <w:r>
+              <w:rPr>
+                <w:sz w:val="18"/>
+                <w:szCs w:val="18"/>
+              </w:rPr>
+              <w:t>0]</w:t>
             </w:r>
           </w:p>
         </w:tc>
@@ -2914,8 +3267,17 @@
                 <w:sz w:val="18"/>
                 <w:szCs w:val="18"/>
               </w:rPr>
-              <w:t>FLTA (actif=1) PLD &gt;uC</w:t>
+              <w:t>FLTA (actif=1) PLD &gt;</w:t>
             </w:r>
+            <w:proofErr w:type="spellStart"/>
+            <w:r>
+              <w:rPr>
+                <w:sz w:val="18"/>
+                <w:szCs w:val="18"/>
+              </w:rPr>
+              <w:t>uC</w:t>
+            </w:r>
+            <w:proofErr w:type="spellEnd"/>
           </w:p>
         </w:tc>
       </w:tr>
@@ -3133,7 +3495,23 @@
                 <w:sz w:val="18"/>
                 <w:szCs w:val="18"/>
               </w:rPr>
-              <w:t>VALID_PWM (actifà1) uC&gt;PLD</w:t>
+              <w:t xml:space="preserve">VALID_PWM (actifà1) </w:t>
+            </w:r>
+            <w:proofErr w:type="spellStart"/>
+            <w:r>
+              <w:rPr>
+                <w:sz w:val="18"/>
+                <w:szCs w:val="18"/>
+              </w:rPr>
+              <w:t>uC</w:t>
+            </w:r>
+            <w:proofErr w:type="spellEnd"/>
+            <w:r>
+              <w:rPr>
+                <w:sz w:val="18"/>
+                <w:szCs w:val="18"/>
+              </w:rPr>
+              <w:t>&gt;PLD</w:t>
             </w:r>
           </w:p>
         </w:tc>
@@ -3336,13 +3714,32 @@
                 <w:lang w:val="en-US"/>
               </w:rPr>
             </w:pPr>
+            <w:proofErr w:type="spellStart"/>
             <w:r>
               <w:rPr>
                 <w:sz w:val="18"/>
                 <w:szCs w:val="18"/>
                 <w:lang w:val="en-US"/>
               </w:rPr>
-              <w:t xml:space="preserve">Valid_Hall </w:t>
+              <w:t>Valid_</w:t>
+            </w:r>
+            <w:proofErr w:type="gramStart"/>
+            <w:r>
+              <w:rPr>
+                <w:sz w:val="18"/>
+                <w:szCs w:val="18"/>
+                <w:lang w:val="en-US"/>
+              </w:rPr>
+              <w:t>Hall</w:t>
+            </w:r>
+            <w:proofErr w:type="spellEnd"/>
+            <w:r>
+              <w:rPr>
+                <w:sz w:val="18"/>
+                <w:szCs w:val="18"/>
+                <w:lang w:val="en-US"/>
+              </w:rPr>
+              <w:t xml:space="preserve"> </w:t>
             </w:r>
             <w:r>
               <w:rPr>
@@ -3350,8 +3747,27 @@
                 <w:szCs w:val="18"/>
                 <w:lang w:val="en-US"/>
               </w:rPr>
-              <w:t xml:space="preserve"> PLD&gt;uC</w:t>
+              <w:t xml:space="preserve"> PLD</w:t>
             </w:r>
+            <w:proofErr w:type="gramEnd"/>
+            <w:r>
+              <w:rPr>
+                <w:sz w:val="18"/>
+                <w:szCs w:val="18"/>
+                <w:lang w:val="en-US"/>
+              </w:rPr>
+              <w:t>&gt;</w:t>
+            </w:r>
+            <w:proofErr w:type="spellStart"/>
+            <w:r>
+              <w:rPr>
+                <w:sz w:val="18"/>
+                <w:szCs w:val="18"/>
+                <w:lang w:val="en-US"/>
+              </w:rPr>
+              <w:t>uC</w:t>
+            </w:r>
+            <w:proofErr w:type="spellEnd"/>
           </w:p>
         </w:tc>
       </w:tr>
@@ -3461,7 +3877,23 @@
                 <w:sz w:val="18"/>
                 <w:szCs w:val="18"/>
               </w:rPr>
-              <w:t>H_2.5MHZ  &gt;PLD</w:t>
+              <w:t>H_2.5</w:t>
+            </w:r>
+            <w:proofErr w:type="gramStart"/>
+            <w:r>
+              <w:rPr>
+                <w:sz w:val="18"/>
+                <w:szCs w:val="18"/>
+              </w:rPr>
+              <w:t>MHZ  &gt;</w:t>
+            </w:r>
+            <w:proofErr w:type="gramEnd"/>
+            <w:r>
+              <w:rPr>
+                <w:sz w:val="18"/>
+                <w:szCs w:val="18"/>
+              </w:rPr>
+              <w:t>PLD</w:t>
             </w:r>
           </w:p>
         </w:tc>
@@ -4155,6 +4587,7 @@
                 <w:szCs w:val="18"/>
               </w:rPr>
             </w:pPr>
+            <w:proofErr w:type="spellStart"/>
             <w:r>
               <w:rPr>
                 <w:sz w:val="18"/>
@@ -4162,6 +4595,7 @@
               </w:rPr>
               <w:t>RD_WRn</w:t>
             </w:r>
+            <w:proofErr w:type="spellEnd"/>
           </w:p>
         </w:tc>
         <w:tc>
@@ -4203,7 +4637,39 @@
                 <w:sz w:val="18"/>
                 <w:szCs w:val="18"/>
               </w:rPr>
-              <w:t xml:space="preserve"> RD_WRn uC&gt;PLD</w:t>
+              <w:t xml:space="preserve"> </w:t>
+            </w:r>
+            <w:proofErr w:type="spellStart"/>
+            <w:r>
+              <w:rPr>
+                <w:sz w:val="18"/>
+                <w:szCs w:val="18"/>
+              </w:rPr>
+              <w:t>RD_WRn</w:t>
+            </w:r>
+            <w:proofErr w:type="spellEnd"/>
+            <w:r>
+              <w:rPr>
+                <w:sz w:val="18"/>
+                <w:szCs w:val="18"/>
+              </w:rPr>
+              <w:t xml:space="preserve"> </w:t>
+            </w:r>
+            <w:proofErr w:type="spellStart"/>
+            <w:r>
+              <w:rPr>
+                <w:sz w:val="18"/>
+                <w:szCs w:val="18"/>
+              </w:rPr>
+              <w:t>uC</w:t>
+            </w:r>
+            <w:proofErr w:type="spellEnd"/>
+            <w:r>
+              <w:rPr>
+                <w:sz w:val="18"/>
+                <w:szCs w:val="18"/>
+              </w:rPr>
+              <w:t>&gt;PLD</w:t>
             </w:r>
           </w:p>
         </w:tc>
@@ -4321,7 +4787,23 @@
                 <w:sz w:val="18"/>
                 <w:szCs w:val="18"/>
               </w:rPr>
-              <w:t>PCS6 uC&gt;PLD</w:t>
+              <w:t xml:space="preserve">PCS6 </w:t>
+            </w:r>
+            <w:proofErr w:type="spellStart"/>
+            <w:r>
+              <w:rPr>
+                <w:sz w:val="18"/>
+                <w:szCs w:val="18"/>
+              </w:rPr>
+              <w:t>uC</w:t>
+            </w:r>
+            <w:proofErr w:type="spellEnd"/>
+            <w:r>
+              <w:rPr>
+                <w:sz w:val="18"/>
+                <w:szCs w:val="18"/>
+              </w:rPr>
+              <w:t>&gt;PLD</w:t>
             </w:r>
           </w:p>
         </w:tc>
@@ -4384,6 +4866,7 @@
                 <w:szCs w:val="18"/>
               </w:rPr>
             </w:pPr>
+            <w:proofErr w:type="spellStart"/>
             <w:r>
               <w:rPr>
                 <w:sz w:val="18"/>
@@ -4391,6 +4874,7 @@
               </w:rPr>
               <w:t>Vgaz</w:t>
             </w:r>
+            <w:proofErr w:type="spellEnd"/>
           </w:p>
         </w:tc>
         <w:tc>
@@ -4440,7 +4924,27 @@
                 <w:sz w:val="18"/>
                 <w:szCs w:val="18"/>
               </w:rPr>
-              <w:t>V GAZ/PEDALAGE (analog)</w:t>
+              <w:t>V GAZ/PEDALAGE (</w:t>
+            </w:r>
+            <w:proofErr w:type="spellStart"/>
+            <w:r>
+              <w:rPr>
+                <w:i/>
+                <w:color w:val="008000"/>
+                <w:sz w:val="18"/>
+                <w:szCs w:val="18"/>
+              </w:rPr>
+              <w:t>analog</w:t>
+            </w:r>
+            <w:proofErr w:type="spellEnd"/>
+            <w:r>
+              <w:rPr>
+                <w:i/>
+                <w:color w:val="008000"/>
+                <w:sz w:val="18"/>
+                <w:szCs w:val="18"/>
+              </w:rPr>
+              <w:t>)</w:t>
             </w:r>
           </w:p>
         </w:tc>
@@ -4503,6 +5007,7 @@
                 <w:szCs w:val="18"/>
               </w:rPr>
             </w:pPr>
+            <w:proofErr w:type="spellStart"/>
             <w:r>
               <w:rPr>
                 <w:sz w:val="18"/>
@@ -4510,6 +5015,7 @@
               </w:rPr>
               <w:t>Vbat</w:t>
             </w:r>
+            <w:proofErr w:type="spellEnd"/>
           </w:p>
         </w:tc>
         <w:tc>
@@ -4559,7 +5065,27 @@
                 <w:sz w:val="18"/>
                 <w:szCs w:val="18"/>
               </w:rPr>
-              <w:t>VBAT (analog)</w:t>
+              <w:t>VBAT (</w:t>
+            </w:r>
+            <w:proofErr w:type="spellStart"/>
+            <w:r>
+              <w:rPr>
+                <w:i/>
+                <w:color w:val="008000"/>
+                <w:sz w:val="18"/>
+                <w:szCs w:val="18"/>
+              </w:rPr>
+              <w:t>analog</w:t>
+            </w:r>
+            <w:proofErr w:type="spellEnd"/>
+            <w:r>
+              <w:rPr>
+                <w:i/>
+                <w:color w:val="008000"/>
+                <w:sz w:val="18"/>
+                <w:szCs w:val="18"/>
+              </w:rPr>
+              <w:t>)</w:t>
             </w:r>
           </w:p>
         </w:tc>
@@ -4622,6 +5148,7 @@
                 <w:szCs w:val="18"/>
               </w:rPr>
             </w:pPr>
+            <w:proofErr w:type="spellStart"/>
             <w:r>
               <w:rPr>
                 <w:sz w:val="18"/>
@@ -4629,6 +5156,7 @@
               </w:rPr>
               <w:t>Vtemp</w:t>
             </w:r>
+            <w:proofErr w:type="spellEnd"/>
           </w:p>
         </w:tc>
         <w:tc>
@@ -4671,6 +5199,7 @@
                 <w:szCs w:val="18"/>
               </w:rPr>
             </w:pPr>
+            <w:proofErr w:type="spellStart"/>
             <w:r>
               <w:rPr>
                 <w:i/>
@@ -4678,7 +5207,37 @@
                 <w:sz w:val="18"/>
                 <w:szCs w:val="18"/>
               </w:rPr>
-              <w:t>VTemp (analog)</w:t>
+              <w:t>VTemp</w:t>
+            </w:r>
+            <w:proofErr w:type="spellEnd"/>
+            <w:r>
+              <w:rPr>
+                <w:i/>
+                <w:color w:val="008000"/>
+                <w:sz w:val="18"/>
+                <w:szCs w:val="18"/>
+              </w:rPr>
+              <w:t xml:space="preserve"> (</w:t>
+            </w:r>
+            <w:proofErr w:type="spellStart"/>
+            <w:r>
+              <w:rPr>
+                <w:i/>
+                <w:color w:val="008000"/>
+                <w:sz w:val="18"/>
+                <w:szCs w:val="18"/>
+              </w:rPr>
+              <w:t>analog</w:t>
+            </w:r>
+            <w:proofErr w:type="spellEnd"/>
+            <w:r>
+              <w:rPr>
+                <w:i/>
+                <w:color w:val="008000"/>
+                <w:sz w:val="18"/>
+                <w:szCs w:val="18"/>
+              </w:rPr>
+              <w:t>)</w:t>
             </w:r>
           </w:p>
         </w:tc>
@@ -4741,6 +5300,7 @@
                 <w:szCs w:val="18"/>
               </w:rPr>
             </w:pPr>
+            <w:proofErr w:type="spellStart"/>
             <w:r>
               <w:rPr>
                 <w:sz w:val="18"/>
@@ -4748,6 +5308,7 @@
               </w:rPr>
               <w:t>VIdc</w:t>
             </w:r>
+            <w:proofErr w:type="spellEnd"/>
           </w:p>
         </w:tc>
         <w:tc>
@@ -4790,6 +5351,7 @@
                 <w:szCs w:val="18"/>
               </w:rPr>
             </w:pPr>
+            <w:proofErr w:type="spellStart"/>
             <w:r>
               <w:rPr>
                 <w:i/>
@@ -4797,7 +5359,37 @@
                 <w:sz w:val="18"/>
                 <w:szCs w:val="18"/>
               </w:rPr>
-              <w:t>VImes (analog)</w:t>
+              <w:t>VImes</w:t>
+            </w:r>
+            <w:proofErr w:type="spellEnd"/>
+            <w:r>
+              <w:rPr>
+                <w:i/>
+                <w:color w:val="008000"/>
+                <w:sz w:val="18"/>
+                <w:szCs w:val="18"/>
+              </w:rPr>
+              <w:t xml:space="preserve"> (</w:t>
+            </w:r>
+            <w:proofErr w:type="spellStart"/>
+            <w:r>
+              <w:rPr>
+                <w:i/>
+                <w:color w:val="008000"/>
+                <w:sz w:val="18"/>
+                <w:szCs w:val="18"/>
+              </w:rPr>
+              <w:t>analog</w:t>
+            </w:r>
+            <w:proofErr w:type="spellEnd"/>
+            <w:r>
+              <w:rPr>
+                <w:i/>
+                <w:color w:val="008000"/>
+                <w:sz w:val="18"/>
+                <w:szCs w:val="18"/>
+              </w:rPr>
+              <w:t>)</w:t>
             </w:r>
           </w:p>
         </w:tc>
@@ -5022,7 +5614,23 @@
         <w:t xml:space="preserve"> </w:t>
       </w:r>
       <w:r>
-        <w:t>tableau générale d’affection des signaux entre le PLD et le uC Mbed LPC1768</w:t>
+        <w:t xml:space="preserve">tableau générale d’affection des signaux entre le PLD et le </w:t>
+      </w:r>
+      <w:proofErr w:type="spellStart"/>
+      <w:r>
+        <w:t>uC</w:t>
+      </w:r>
+      <w:proofErr w:type="spellEnd"/>
+      <w:r>
+        <w:t xml:space="preserve"> </w:t>
+      </w:r>
+      <w:proofErr w:type="spellStart"/>
+      <w:r>
+        <w:t>Mbed</w:t>
+      </w:r>
+      <w:proofErr w:type="spellEnd"/>
+      <w:r>
+        <w:t xml:space="preserve"> LPC1768</w:t>
       </w:r>
     </w:p>
     <w:p>
@@ -5043,8 +5651,16 @@
           <w:rPr>
             <w:rStyle w:val="Lienhypertexte"/>
           </w:rPr>
-          <w:t>MBED shield</w:t>
+          <w:t xml:space="preserve">MBED </w:t>
         </w:r>
+        <w:proofErr w:type="spellStart"/>
+        <w:r>
+          <w:rPr>
+            <w:rStyle w:val="Lienhypertexte"/>
+          </w:rPr>
+          <w:t>shield</w:t>
+        </w:r>
+        <w:proofErr w:type="spellEnd"/>
       </w:hyperlink>
       <w:r>
         <w:t xml:space="preserve"> figure des connecteurs de liaison GROVE notés</w:t>
@@ -5083,7 +5699,23 @@
           <w:b/>
           <w:color w:val="FF0000"/>
         </w:rPr>
-        <w:t>J13 :RX3/SCL1 :P10 en conflit avec le port // 8bits réservé, TX3/SDA1 :P9  en conflit avec le port // 8bits réservé</w:t>
+        <w:t>J13 :RX3/SCL1 :P10 en conflit avec le port // 8bits réservé, TX3/SDA1 :P</w:t>
+      </w:r>
+      <w:proofErr w:type="gramStart"/>
+      <w:r>
+        <w:rPr>
+          <w:b/>
+          <w:color w:val="FF0000"/>
+        </w:rPr>
+        <w:t>9  en</w:t>
+      </w:r>
+      <w:proofErr w:type="gramEnd"/>
+      <w:r>
+        <w:rPr>
+          <w:b/>
+          <w:color w:val="FF0000"/>
+        </w:rPr>
+        <w:t xml:space="preserve"> conflit avec le port // 8bits réservé</w:t>
       </w:r>
     </w:p>
     <w:p>
@@ -5101,11 +5733,19 @@
           <w:b/>
         </w:rPr>
       </w:pPr>
+      <w:proofErr w:type="spellStart"/>
       <w:r>
         <w:rPr>
           <w:b/>
         </w:rPr>
-        <w:t>Led locales disponibles sur le module LPC1768</w:t>
+        <w:t>Led</w:t>
+      </w:r>
+      <w:proofErr w:type="spellEnd"/>
+      <w:r>
+        <w:rPr>
+          <w:b/>
+        </w:rPr>
+        <w:t xml:space="preserve"> locales disponibles sur le module LPC1768</w:t>
       </w:r>
     </w:p>
     <w:p>
@@ -5115,11 +5755,19 @@
           <w:lang w:val="en-US"/>
         </w:rPr>
       </w:pPr>
+      <w:proofErr w:type="spellStart"/>
       <w:r>
         <w:rPr>
           <w:lang w:val="en-US"/>
         </w:rPr>
-        <w:t>DigitalOut led1(LED1); //available</w:t>
+        <w:t>DigitalOut</w:t>
+      </w:r>
+      <w:proofErr w:type="spellEnd"/>
+      <w:r>
+        <w:rPr>
+          <w:lang w:val="en-US"/>
+        </w:rPr>
+        <w:t xml:space="preserve"> led1(LED1); //available</w:t>
       </w:r>
     </w:p>
     <w:p>
@@ -5129,11 +5777,33 @@
           <w:lang w:val="en-US"/>
         </w:rPr>
       </w:pPr>
+      <w:proofErr w:type="spellStart"/>
       <w:r>
         <w:rPr>
           <w:lang w:val="en-US"/>
         </w:rPr>
-        <w:t>DigitalOut led2(LED2);// available</w:t>
+        <w:t>DigitalOut</w:t>
+      </w:r>
+      <w:proofErr w:type="spellEnd"/>
+      <w:r>
+        <w:rPr>
+          <w:lang w:val="en-US"/>
+        </w:rPr>
+        <w:t xml:space="preserve"> led2(LED</w:t>
+      </w:r>
+      <w:proofErr w:type="gramStart"/>
+      <w:r>
+        <w:rPr>
+          <w:lang w:val="en-US"/>
+        </w:rPr>
+        <w:t>2);/</w:t>
+      </w:r>
+      <w:proofErr w:type="gramEnd"/>
+      <w:r>
+        <w:rPr>
+          <w:lang w:val="en-US"/>
+        </w:rPr>
+        <w:t>/ available</w:t>
       </w:r>
     </w:p>
     <w:p>
@@ -5143,11 +5813,19 @@
           <w:lang w:val="en-US"/>
         </w:rPr>
       </w:pPr>
+      <w:proofErr w:type="spellStart"/>
       <w:r>
         <w:rPr>
           <w:lang w:val="en-US"/>
         </w:rPr>
-        <w:t>DigitalOut led3(LED3); // blink when can message is sent</w:t>
+        <w:t>DigitalOut</w:t>
+      </w:r>
+      <w:proofErr w:type="spellEnd"/>
+      <w:r>
+        <w:rPr>
+          <w:lang w:val="en-US"/>
+        </w:rPr>
+        <w:t xml:space="preserve"> led3(LED3); // blink when can message is sent</w:t>
       </w:r>
     </w:p>
     <w:p>
@@ -5157,18 +5835,26 @@
           <w:lang w:val="en-US"/>
         </w:rPr>
       </w:pPr>
+      <w:proofErr w:type="spellStart"/>
       <w:r>
         <w:rPr>
           <w:lang w:val="en-US"/>
         </w:rPr>
-        <w:t>DigitalOut led4(LED4); // blink when can message is received</w:t>
-      </w:r>
-    </w:p>
-    <w:p>
-      <w:pPr>
+        <w:t>DigitalOut</w:t>
+      </w:r>
+      <w:proofErr w:type="spellEnd"/>
+      <w:r>
         <w:rPr>
           <w:lang w:val="en-US"/>
         </w:rPr>
+        <w:t xml:space="preserve"> led4(LED4); // blink when can message is received</w:t>
+      </w:r>
+    </w:p>
+    <w:p>
+      <w:pPr>
+        <w:rPr>
+          <w:lang w:val="en-US"/>
+        </w:rPr>
       </w:pPr>
     </w:p>
     <w:p>
@@ -5176,6 +5862,7 @@
         <w:rPr>
           <w:noProof/>
         </w:rPr>
+        <w:lastRenderedPageBreak/>
         <w:drawing>
           <wp:anchor distT="0" distB="0" distL="114300" distR="114300" simplePos="0" relativeHeight="251658240" behindDoc="0" locked="0" layoutInCell="1" allowOverlap="1" wp14:anchorId="510A045E" wp14:editId="08565874">
             <wp:simplePos x="0" y="0"/>
@@ -5315,12 +6002,36 @@
     </w:p>
     <w:p>
       <w:r>
-        <w:t xml:space="preserve">La Partie puissance est assurée par un onduleur triphasé préfabriqué (boite noire voir sur la figure 1 ) sur lequel nous avons extrait et dirigé les 6 commandes de transistor des bras d’onduleur vers le PLD ALTERA à  savoir AH/AL, BH/BL, CH/CL  (c’est le PLD  qui assurera donc le commande des 3 bras d’onduleur) à partir de la connaissance de la position instantanée du rotor (inducteur) du moteur. </w:t>
-      </w:r>
-    </w:p>
-    <w:p>
-      <w:r>
-        <w:t>A partir de là il élabore les 3 consignes de tension VA,VB,VC en fonction de la position actuelle du rotor (capteurs Hall[C,B,A] ) et de la consigne de vitesse que désire l’utilisateur (Référence PWM au format 8 bits // fournis par le uC MBED au PLD ALTERA).</w:t>
+        <w:t xml:space="preserve">La Partie puissance est assurée par un onduleur triphasé préfabriqué (boite noire voir sur la figure 1 ) sur lequel nous avons extrait et dirigé les 6 commandes de transistor des bras d’onduleur vers le PLD ALTERA </w:t>
+      </w:r>
+      <w:proofErr w:type="gramStart"/>
+      <w:r>
+        <w:t>à  savoir</w:t>
+      </w:r>
+      <w:proofErr w:type="gramEnd"/>
+      <w:r>
+        <w:t xml:space="preserve"> AH/AL, BH/BL, CH/CL  (c’est le </w:t>
+      </w:r>
+      <w:proofErr w:type="gramStart"/>
+      <w:r>
+        <w:t>PLD  qui</w:t>
+      </w:r>
+      <w:proofErr w:type="gramEnd"/>
+      <w:r>
+        <w:t xml:space="preserve"> assurera donc le commande des 3 bras d’onduleur) à partir de la connaissance de la position instantanée du rotor (inducteur) du moteur. </w:t>
+      </w:r>
+    </w:p>
+    <w:p>
+      <w:r>
+        <w:t xml:space="preserve">A partir de là il élabore les 3 consignes de tension VA,VB,VC en fonction de la position actuelle du rotor (capteurs Hall[C,B,A] ) et de la consigne de vitesse que désire l’utilisateur (Référence PWM au format 8 bits // fournis par le </w:t>
+      </w:r>
+      <w:proofErr w:type="spellStart"/>
+      <w:r>
+        <w:t>uC</w:t>
+      </w:r>
+      <w:proofErr w:type="spellEnd"/>
+      <w:r>
+        <w:t xml:space="preserve"> MBED au PLD ALTERA).</w:t>
       </w:r>
     </w:p>
     <w:p>
@@ -5328,13 +6039,29 @@
         <w:pStyle w:val="Titre1"/>
       </w:pPr>
       <w:r>
-        <w:t>Principe d</w:t>
+        <w:t xml:space="preserve">Principe </w:t>
+      </w:r>
+      <w:proofErr w:type="gramStart"/>
+      <w:r>
+        <w:t>d</w:t>
       </w:r>
       <w:r>
         <w:t xml:space="preserve">’autopilotage </w:t>
       </w:r>
       <w:r>
-        <w:t xml:space="preserve"> du moteur synchrone brushless en </w:t>
+        <w:t xml:space="preserve"> du</w:t>
+      </w:r>
+      <w:proofErr w:type="gramEnd"/>
+      <w:r>
+        <w:t xml:space="preserve"> moteur synchrone </w:t>
+      </w:r>
+      <w:proofErr w:type="spellStart"/>
+      <w:r>
+        <w:t>brushless</w:t>
+      </w:r>
+      <w:proofErr w:type="spellEnd"/>
+      <w:r>
+        <w:t xml:space="preserve"> en </w:t>
       </w:r>
       <w:r>
         <w:t>commande</w:t>
@@ -5343,8 +6070,13 @@
         <w:t xml:space="preserve"> trapèze</w:t>
       </w:r>
       <w:r>
-        <w:t xml:space="preserve"> via le PLD altera</w:t>
-      </w:r>
+        <w:t xml:space="preserve"> via le PLD </w:t>
+      </w:r>
+      <w:proofErr w:type="spellStart"/>
+      <w:r>
+        <w:t>altera</w:t>
+      </w:r>
+      <w:proofErr w:type="spellEnd"/>
       <w:r>
         <w:t>.</w:t>
       </w:r>
@@ -5360,17 +6092,64 @@
         <w:t xml:space="preserve">o de </w:t>
       </w:r>
       <w:r>
-        <w:t>vulgarisation du principe de commande d’un moteur brushless a commande trapeze :</w:t>
-      </w:r>
-    </w:p>
-    <w:p>
-      <w:r>
-        <w:t xml:space="preserve">(texas instruments) </w:t>
+        <w:t xml:space="preserve">vulgarisation du principe de commande d’un moteur </w:t>
+      </w:r>
+      <w:proofErr w:type="spellStart"/>
+      <w:r>
+        <w:t>brushless</w:t>
+      </w:r>
+      <w:proofErr w:type="spellEnd"/>
+      <w:r>
+        <w:t xml:space="preserve"> a </w:t>
+      </w:r>
+      <w:proofErr w:type="spellStart"/>
+      <w:r>
+        <w:t>commande</w:t>
+      </w:r>
+      <w:proofErr w:type="spellEnd"/>
+      <w:r>
+        <w:t xml:space="preserve"> </w:t>
+      </w:r>
+      <w:proofErr w:type="spellStart"/>
+      <w:r>
+        <w:t>trapeze</w:t>
+      </w:r>
+      <w:proofErr w:type="spellEnd"/>
+      <w:r>
+        <w:t> :</w:t>
+      </w:r>
+    </w:p>
+    <w:p>
+      <w:pPr>
+        <w:rPr>
+          <w:lang w:val="en-GB"/>
+        </w:rPr>
+      </w:pPr>
+      <w:r>
+        <w:rPr>
+          <w:lang w:val="en-GB"/>
+        </w:rPr>
+        <w:t>(</w:t>
+      </w:r>
+      <w:proofErr w:type="spellStart"/>
+      <w:r>
+        <w:rPr>
+          <w:lang w:val="en-GB"/>
+        </w:rPr>
+        <w:t>texas</w:t>
+      </w:r>
+      <w:proofErr w:type="spellEnd"/>
+      <w:r>
+        <w:rPr>
+          <w:lang w:val="en-GB"/>
+        </w:rPr>
+        <w:t xml:space="preserve"> instruments) </w:t>
       </w:r>
       <w:hyperlink r:id="rId21" w:history="1">
         <w:r>
           <w:rPr>
             <w:rStyle w:val="Lienhypertexte"/>
+            <w:lang w:val="en-GB"/>
           </w:rPr>
           <w:t>https://www.youtube.com/watch?v=xIORHY8Ii90</w:t>
         </w:r>
@@ -5378,7 +6157,23 @@
     </w:p>
     <w:p>
       <w:r>
-        <w:t>Il y a en fait 6 états possibles d’alimentation du stator du moteur brushless en fonction des 6 positions différentes mesurables par les 3 capteurs de position à effets hall du Rotor  (HALL[CBA],les positions « 000 » et « 111 » étant impossibles  ou équivalentes à une défaillance d</w:t>
+        <w:t xml:space="preserve">Il y a en fait 6 états possibles d’alimentation du stator du moteur </w:t>
+      </w:r>
+      <w:proofErr w:type="spellStart"/>
+      <w:r>
+        <w:t>brushless</w:t>
+      </w:r>
+      <w:proofErr w:type="spellEnd"/>
+      <w:r>
+        <w:t xml:space="preserve"> en fonction des 6 positions différentes mesurables par les 3 capteurs de position à effets hall du Rotor  (HALL[CBA],les positions « 000 » et « 111 » étant </w:t>
+      </w:r>
+      <w:proofErr w:type="gramStart"/>
+      <w:r>
+        <w:t>impossibles  ou</w:t>
+      </w:r>
+      <w:proofErr w:type="gramEnd"/>
+      <w:r>
+        <w:t xml:space="preserve"> équivalentes à une défaillance d</w:t>
       </w:r>
       <w:r>
         <w:t xml:space="preserve">es capteurs du </w:t>
@@ -6081,8 +6876,13 @@
       <w:r>
         <w:t xml:space="preserve"> avec </w:t>
       </w:r>
-      <w:r>
-        <w:t>PhaseB+ et phase C-</w:t>
+      <w:proofErr w:type="spellStart"/>
+      <w:r>
+        <w:t>PhaseB</w:t>
+      </w:r>
+      <w:proofErr w:type="spellEnd"/>
+      <w:r>
+        <w:t>+ et phase C-</w:t>
       </w:r>
       <w:r>
         <w:t xml:space="preserve">) et </w:t>
@@ -6109,7 +6909,15 @@
         <w:t>droite</w:t>
       </w:r>
       <w:r>
-        <w:t xml:space="preserve"> avec PhaseB+ et Phase A-</w:t>
+        <w:t xml:space="preserve"> avec </w:t>
+      </w:r>
+      <w:proofErr w:type="spellStart"/>
+      <w:r>
+        <w:t>PhaseB</w:t>
+      </w:r>
+      <w:proofErr w:type="spellEnd"/>
+      <w:r>
+        <w:t>+ et Phase A-</w:t>
       </w:r>
     </w:p>
     <w:p>
@@ -6117,6 +6925,7 @@
         <w:rPr>
           <w:noProof/>
         </w:rPr>
+        <w:lastRenderedPageBreak/>
         <mc:AlternateContent>
           <mc:Choice Requires="wps">
             <w:drawing>
@@ -7388,7 +8197,15 @@
         <w:t xml:space="preserve">angulaire </w:t>
       </w:r>
       <w:r>
-        <w:t>instantanée du rotor (c’est ce que l’on appelle l’autopilotage du brushless). Cette fonction est en fait l’équivalent d’un collecteur numérique  (sa version numérique existe dans le moteur à courant continu classique).</w:t>
+        <w:t xml:space="preserve">instantanée du rotor (c’est ce que l’on appelle l’autopilotage du </w:t>
+      </w:r>
+      <w:proofErr w:type="spellStart"/>
+      <w:r>
+        <w:t>brushless</w:t>
+      </w:r>
+      <w:proofErr w:type="spellEnd"/>
+      <w:r>
+        <w:t>). Cette fonction est en fait l’équivalent d’un collecteur numérique  (sa version numérique existe dans le moteur à courant continu classique).</w:t>
       </w:r>
     </w:p>
     <w:p>
@@ -7502,14 +8319,28 @@
           </wp:anchor>
         </w:drawing>
       </w:r>
-      <w:r>
-        <w:t>Préliminaires  ouverture  du projet Quartus PLD_mbed_etudiant :</w:t>
+      <w:proofErr w:type="gramStart"/>
+      <w:r>
+        <w:t>Préliminaires  ouverture</w:t>
+      </w:r>
+      <w:proofErr w:type="gramEnd"/>
+      <w:r>
+        <w:t xml:space="preserve">  du projet Quartus </w:t>
+      </w:r>
+      <w:proofErr w:type="spellStart"/>
+      <w:r>
+        <w:t>PLD_mbed_etudiant</w:t>
+      </w:r>
+      <w:proofErr w:type="spellEnd"/>
+      <w:r>
+        <w:t> :</w:t>
       </w:r>
     </w:p>
     <w:p>
       <w:r>
         <w:t xml:space="preserve">Télécharger le dossier </w:t>
       </w:r>
+      <w:proofErr w:type="gramStart"/>
       <w:r>
         <w:t>projet</w:t>
       </w:r>
@@ -7517,10 +8348,30 @@
         <w:t xml:space="preserve">_altera_sae_roue.zip </w:t>
       </w:r>
       <w:r>
-        <w:t xml:space="preserve"> depuis LMS </w:t>
-      </w:r>
-      <w:r>
-        <w:t>depuis le cours sae roue et decompresser dans votre dossier z:</w:t>
+        <w:t xml:space="preserve"> depuis</w:t>
+      </w:r>
+      <w:proofErr w:type="gramEnd"/>
+      <w:r>
+        <w:t xml:space="preserve"> LMS </w:t>
+      </w:r>
+      <w:r>
+        <w:t xml:space="preserve">depuis le cours </w:t>
+      </w:r>
+      <w:proofErr w:type="spellStart"/>
+      <w:r>
+        <w:t>sae</w:t>
+      </w:r>
+      <w:proofErr w:type="spellEnd"/>
+      <w:r>
+        <w:t xml:space="preserve"> roue et </w:t>
+      </w:r>
+      <w:proofErr w:type="spellStart"/>
+      <w:r>
+        <w:t>decompresser</w:t>
+      </w:r>
+      <w:proofErr w:type="spellEnd"/>
+      <w:r>
+        <w:t xml:space="preserve"> dans votre dossier z:</w:t>
       </w:r>
       <w:r>
         <w:t>\sae_roue\</w:t>
@@ -7576,6 +8427,7 @@
         </w:rPr>
         <w:t xml:space="preserve">menu File&gt;open projet&gt; </w:t>
       </w:r>
+      <w:proofErr w:type="spellStart"/>
       <w:r>
         <w:rPr>
           <w:i/>
@@ -7592,6 +8444,7 @@
         </w:rPr>
         <w:t>LD_mbed_etudiant</w:t>
       </w:r>
+      <w:proofErr w:type="spellEnd"/>
       <w:r>
         <w:rPr>
           <w:color w:val="0070C0"/>
@@ -7601,12 +8454,19 @@
     </w:p>
     <w:p>
       <w:r>
+        <w:lastRenderedPageBreak/>
         <w:tab/>
-        <w:t>Le projet contient actuellement 2 fichiers sources bdf</w:t>
-      </w:r>
+        <w:t xml:space="preserve">Le projet contient actuellement 2 fichiers sources </w:t>
+      </w:r>
+      <w:proofErr w:type="spellStart"/>
+      <w:r>
+        <w:t>bdf</w:t>
+      </w:r>
+      <w:proofErr w:type="spellEnd"/>
     </w:p>
     <w:p/>
     <w:p>
+      <w:proofErr w:type="spellStart"/>
       <w:r>
         <w:rPr>
           <w:b/>
@@ -7615,6 +8475,7 @@
         </w:rPr>
         <w:t>Bloc_io_mbed.vhd</w:t>
       </w:r>
+      <w:proofErr w:type="spellEnd"/>
       <w:r>
         <w:rPr>
           <w:color w:val="0070C0"/>
@@ -7622,10 +8483,19 @@
         <w:t> </w:t>
       </w:r>
       <w:r>
-        <w:t>: bibliothèque permettant un dialogue bidirectionnel 8 bits entre le PLD altera et le microprocesseur MBED LPC1768.</w:t>
-      </w:r>
-    </w:p>
-    <w:p>
+        <w:t xml:space="preserve">: bibliothèque permettant un dialogue bidirectionnel 8 bits entre le PLD </w:t>
+      </w:r>
+      <w:proofErr w:type="spellStart"/>
+      <w:r>
+        <w:t>altera</w:t>
+      </w:r>
+      <w:proofErr w:type="spellEnd"/>
+      <w:r>
+        <w:t xml:space="preserve"> et le microprocesseur MBED LPC1768.</w:t>
+      </w:r>
+    </w:p>
+    <w:p>
+      <w:proofErr w:type="spellStart"/>
       <w:r>
         <w:rPr>
           <w:b/>
@@ -7634,6 +8504,7 @@
         </w:rPr>
         <w:t>Matrix_scooter_pwm_mbed_etudiant</w:t>
       </w:r>
+      <w:proofErr w:type="spellEnd"/>
       <w:r>
         <w:rPr>
           <w:color w:val="0070C0"/>
@@ -7646,13 +8517,21 @@
     </w:p>
     <w:p>
       <w:r>
-        <w:t>Assemblage futur des bloc</w:t>
+        <w:t xml:space="preserve">Assemblage futur des </w:t>
+      </w:r>
+      <w:proofErr w:type="gramStart"/>
+      <w:r>
+        <w:t>bloc</w:t>
       </w:r>
       <w:r>
         <w:t xml:space="preserve">s </w:t>
       </w:r>
       <w:r>
-        <w:t xml:space="preserve"> à créer</w:t>
+        <w:t xml:space="preserve"> à</w:t>
+      </w:r>
+      <w:proofErr w:type="gramEnd"/>
+      <w:r>
+        <w:t xml:space="preserve"> créer</w:t>
       </w:r>
       <w:r>
         <w:t xml:space="preserve"> en langage VHDL</w:t>
@@ -7708,8 +8587,13 @@
         <w:pStyle w:val="Titre2"/>
       </w:pPr>
       <w:r>
-        <w:t>TP3_1 :Collecteur numérique du moteur brushless</w:t>
-      </w:r>
+        <w:t xml:space="preserve">TP3_1 :Collecteur numérique du moteur </w:t>
+      </w:r>
+      <w:proofErr w:type="spellStart"/>
+      <w:r>
+        <w:t>brushless</w:t>
+      </w:r>
+      <w:proofErr w:type="spellEnd"/>
     </w:p>
     <w:p>
       <w:r>
@@ -7783,7 +8667,23 @@
         <w:t>Rôle :</w:t>
       </w:r>
       <w:r>
-        <w:t xml:space="preserve"> Ce bloc permet de commander les 6 transistors de l’onduleur triphasé. Les transistor du Bas PWMxL sont commandés en mode pleine onde et réalisent la fonction de collecteur numérique. Les sorties PWMxH distribue la consigne de PWM reçue à l’entrée en direction des transistors situés en haut de l’onduleur.</w:t>
+        <w:t xml:space="preserve"> Ce bloc permet de commander les 6 transistors de l’onduleur triphasé. Les transistor du Bas </w:t>
+      </w:r>
+      <w:proofErr w:type="spellStart"/>
+      <w:r>
+        <w:t>PWMxL</w:t>
+      </w:r>
+      <w:proofErr w:type="spellEnd"/>
+      <w:r>
+        <w:t xml:space="preserve"> sont commandés en mode pleine onde et réalisent la fonction de collecteur numérique. Les sorties </w:t>
+      </w:r>
+      <w:proofErr w:type="spellStart"/>
+      <w:r>
+        <w:t>PWMxH</w:t>
+      </w:r>
+      <w:proofErr w:type="spellEnd"/>
+      <w:r>
+        <w:t xml:space="preserve"> distribue la consigne de PWM reçue à l’entrée en direction des transistors situés en haut de l’onduleur.</w:t>
       </w:r>
     </w:p>
     <w:p/>
@@ -7814,20 +8714,83 @@
           <w:numId w:val="39"/>
         </w:numPr>
       </w:pPr>
+      <w:proofErr w:type="spellStart"/>
       <w:r>
         <w:rPr>
           <w:b/>
         </w:rPr>
         <w:t>Hall_FILTRE</w:t>
       </w:r>
-      <w:r>
-        <w:t xml:space="preserve">[2..0]: Ce bloc reçoit l’information sur la valeur des 3 capteurs hall. Correspondant à HallC, HallB, HallA. En fonction de cette information, ce bloc pilote  les </w:t>
+      <w:proofErr w:type="spellEnd"/>
+      <w:r>
+        <w:t>[</w:t>
+      </w:r>
+      <w:proofErr w:type="gramStart"/>
+      <w:r>
+        <w:t>2..</w:t>
+      </w:r>
+      <w:proofErr w:type="gramEnd"/>
+      <w:r>
+        <w:t xml:space="preserve">0]: Ce bloc reçoit l’information sur la valeur des 3 capteurs hall. Correspondant à </w:t>
+      </w:r>
+      <w:proofErr w:type="spellStart"/>
+      <w:r>
+        <w:t>HallC</w:t>
+      </w:r>
+      <w:proofErr w:type="spellEnd"/>
+      <w:r>
+        <w:t xml:space="preserve">, </w:t>
+      </w:r>
+      <w:proofErr w:type="spellStart"/>
+      <w:r>
+        <w:t>HallB</w:t>
+      </w:r>
+      <w:proofErr w:type="spellEnd"/>
+      <w:r>
+        <w:t xml:space="preserve">, </w:t>
+      </w:r>
+      <w:proofErr w:type="spellStart"/>
+      <w:r>
+        <w:t>HallA</w:t>
+      </w:r>
+      <w:proofErr w:type="spellEnd"/>
+      <w:r>
+        <w:t xml:space="preserve">. En fonction de cette information, ce bloc </w:t>
+      </w:r>
+      <w:proofErr w:type="gramStart"/>
+      <w:r>
+        <w:t>pilote  les</w:t>
+      </w:r>
+      <w:proofErr w:type="gramEnd"/>
+      <w:r>
+        <w:t xml:space="preserve"> </w:t>
       </w:r>
       <w:r>
         <w:t>3</w:t>
       </w:r>
       <w:r>
-        <w:t xml:space="preserve"> transistors du bas  PWMxL et distribue la MLI sur l’un des 3 transistors du Haut PWMxH.</w:t>
+        <w:t xml:space="preserve"> transistors du </w:t>
+      </w:r>
+      <w:proofErr w:type="gramStart"/>
+      <w:r>
+        <w:t xml:space="preserve">bas  </w:t>
+      </w:r>
+      <w:proofErr w:type="spellStart"/>
+      <w:r>
+        <w:t>PWMxL</w:t>
+      </w:r>
+      <w:proofErr w:type="spellEnd"/>
+      <w:proofErr w:type="gramEnd"/>
+      <w:r>
+        <w:t xml:space="preserve"> et distribue la MLI sur l’un des 3 transistors du Haut </w:t>
+      </w:r>
+      <w:proofErr w:type="spellStart"/>
+      <w:r>
+        <w:t>PWMxH</w:t>
+      </w:r>
+      <w:proofErr w:type="spellEnd"/>
+      <w:r>
+        <w:t>.</w:t>
       </w:r>
     </w:p>
     <w:p>
@@ -7845,7 +8808,15 @@
         <w:t>VALID_HALL :</w:t>
       </w:r>
       <w:r>
-        <w:t xml:space="preserve"> Le signal valid_hall indique à quel moment les capteurs de halls présentent une valeur stable. (Actif à 1)</w:t>
+        <w:t xml:space="preserve"> Le signal </w:t>
+      </w:r>
+      <w:proofErr w:type="spellStart"/>
+      <w:r>
+        <w:t>valid_hall</w:t>
+      </w:r>
+      <w:proofErr w:type="spellEnd"/>
+      <w:r>
+        <w:t xml:space="preserve"> indique à quel moment les capteurs de halls présentent une valeur stable. (Actif à 1)</w:t>
       </w:r>
     </w:p>
     <w:p>
@@ -7930,14 +8901,52 @@
           <w:numId w:val="40"/>
         </w:numPr>
       </w:pPr>
+      <w:proofErr w:type="spellStart"/>
       <w:r>
         <w:rPr>
           <w:b/>
         </w:rPr>
-        <w:t>PWMxL et PWMxH </w:t>
-      </w:r>
-      <w:r>
-        <w:t>: commandes logique des transistors du haut (xH) et du bas (xL) de l’onduleur.</w:t>
+        <w:t>PWMxL</w:t>
+      </w:r>
+      <w:proofErr w:type="spellEnd"/>
+      <w:r>
+        <w:rPr>
+          <w:b/>
+        </w:rPr>
+        <w:t xml:space="preserve"> et </w:t>
+      </w:r>
+      <w:proofErr w:type="spellStart"/>
+      <w:r>
+        <w:rPr>
+          <w:b/>
+        </w:rPr>
+        <w:t>PWMxH</w:t>
+      </w:r>
+      <w:proofErr w:type="spellEnd"/>
+      <w:r>
+        <w:rPr>
+          <w:b/>
+        </w:rPr>
+        <w:t> </w:t>
+      </w:r>
+      <w:r>
+        <w:t>: commandes logique des transistors du haut (</w:t>
+      </w:r>
+      <w:proofErr w:type="spellStart"/>
+      <w:r>
+        <w:t>xH</w:t>
+      </w:r>
+      <w:proofErr w:type="spellEnd"/>
+      <w:r>
+        <w:t>) et du bas (</w:t>
+      </w:r>
+      <w:proofErr w:type="spellStart"/>
+      <w:r>
+        <w:t>xL</w:t>
+      </w:r>
+      <w:proofErr w:type="spellEnd"/>
+      <w:r>
+        <w:t>) de l’onduleur.</w:t>
       </w:r>
     </w:p>
     <w:p>
@@ -7976,6 +8985,7 @@
         <w:rPr>
           <w:noProof/>
         </w:rPr>
+        <w:lastRenderedPageBreak/>
         <w:drawing>
           <wp:inline distT="0" distB="0" distL="0" distR="0" wp14:anchorId="2A2F0DBE" wp14:editId="4BDBC4D3">
             <wp:extent cx="6567805" cy="1391285"/>
@@ -8054,7 +9064,15 @@
         </w:r>
       </w:fldSimple>
       <w:r>
-        <w:t> : chronogramme de fonctionnement du bloc collecteur_num en marche Avant</w:t>
+        <w:t xml:space="preserve"> : chronogramme de fonctionnement du bloc </w:t>
+      </w:r>
+      <w:proofErr w:type="spellStart"/>
+      <w:r>
+        <w:t>collecteur_num</w:t>
+      </w:r>
+      <w:proofErr w:type="spellEnd"/>
+      <w:r>
+        <w:t xml:space="preserve"> en marche Avant</w:t>
       </w:r>
     </w:p>
     <w:p>
@@ -8146,7 +9164,15 @@
         </w:r>
       </w:fldSimple>
       <w:r>
-        <w:t xml:space="preserve"> : chronogramme de fonctionnement du bloc collecteur_num en marche AR </w:t>
+        <w:t xml:space="preserve"> : chronogramme de fonctionnement du bloc </w:t>
+      </w:r>
+      <w:proofErr w:type="spellStart"/>
+      <w:r>
+        <w:t>collecteur_num</w:t>
+      </w:r>
+      <w:proofErr w:type="spellEnd"/>
+      <w:r>
+        <w:t xml:space="preserve"> en marche AR </w:t>
       </w:r>
     </w:p>
     <w:p>
@@ -8160,7 +9186,15 @@
         <w:t>implémentera que le fonctionnement en marche avant.</w:t>
       </w:r>
       <w:r>
-        <w:t xml:space="preserve"> Si vous etes en avance vous pourriez rajouter la gestion de la marche arrière.</w:t>
+        <w:t xml:space="preserve"> Si vous </w:t>
+      </w:r>
+      <w:proofErr w:type="spellStart"/>
+      <w:r>
+        <w:t>etes</w:t>
+      </w:r>
+      <w:proofErr w:type="spellEnd"/>
+      <w:r>
+        <w:t xml:space="preserve"> en avance vous pourriez rajouter la gestion de la marche arrière.</w:t>
       </w:r>
     </w:p>
     <w:p>
@@ -8177,20 +9211,54 @@
       <w:r>
         <w:t xml:space="preserve">VHDL </w:t>
       </w:r>
+      <w:proofErr w:type="spellStart"/>
       <w:r>
         <w:t>collecteur_num.</w:t>
       </w:r>
       <w:r>
         <w:t>vhd</w:t>
       </w:r>
-      <w:r>
-        <w:t xml:space="preserve"> et le mettre en top level entity puis le compléter</w:t>
+      <w:proofErr w:type="spellEnd"/>
+      <w:r>
+        <w:t xml:space="preserve"> et le mettre en top </w:t>
+      </w:r>
+      <w:proofErr w:type="spellStart"/>
+      <w:r>
+        <w:t>level</w:t>
+      </w:r>
+      <w:proofErr w:type="spellEnd"/>
+      <w:r>
+        <w:t xml:space="preserve"> </w:t>
+      </w:r>
+      <w:proofErr w:type="spellStart"/>
+      <w:r>
+        <w:t>entity</w:t>
+      </w:r>
+      <w:proofErr w:type="spellEnd"/>
+      <w:r>
+        <w:t xml:space="preserve"> puis le compléter</w:t>
       </w:r>
       <w:r>
         <w:t xml:space="preserve"> en respectant scrupuleusement les noms des E/S déclarées dans l’entité</w:t>
       </w:r>
       <w:r>
-        <w:t>, le  compiler et le simuler. On fournit un squelette de fichier de vecteurs de test collecteur_num.vwf.</w:t>
+        <w:t xml:space="preserve">, </w:t>
+      </w:r>
+      <w:proofErr w:type="gramStart"/>
+      <w:r>
+        <w:t>le  compiler</w:t>
+      </w:r>
+      <w:proofErr w:type="gramEnd"/>
+      <w:r>
+        <w:t xml:space="preserve"> et le simuler. On fournit un squelette de fichier de vecteurs de test </w:t>
+      </w:r>
+      <w:proofErr w:type="spellStart"/>
+      <w:r>
+        <w:t>collecteur_num.vwf</w:t>
+      </w:r>
+      <w:proofErr w:type="spellEnd"/>
+      <w:r>
+        <w:t>.</w:t>
       </w:r>
     </w:p>
     <w:p>
@@ -8211,14 +9279,24 @@
         <w:t xml:space="preserve">Insérer ici votre </w:t>
       </w:r>
       <w:r>
-        <w:t>code vhdl</w:t>
-      </w:r>
-      <w:r>
-        <w:t xml:space="preserve"> de collecteur_num.</w:t>
+        <w:t xml:space="preserve">code </w:t>
+      </w:r>
+      <w:proofErr w:type="spellStart"/>
+      <w:r>
+        <w:t>vhdl</w:t>
+      </w:r>
+      <w:proofErr w:type="spellEnd"/>
+      <w:r>
+        <w:t xml:space="preserve"> de </w:t>
+      </w:r>
+      <w:proofErr w:type="spellStart"/>
+      <w:r>
+        <w:t>collecteur_num.</w:t>
       </w:r>
       <w:r>
         <w:t>vhd</w:t>
       </w:r>
+      <w:proofErr w:type="spellEnd"/>
       <w:r>
         <w:t xml:space="preserve"> </w:t>
       </w:r>
@@ -8265,7 +9343,15 @@
         <w:jc w:val="left"/>
       </w:pPr>
       <w:r>
-        <w:t>Ouvrir le squelette de simulation collecteur_num.vwf et lancer une simulation fonctionnelle. Comparez aux résultats attendus</w:t>
+        <w:t xml:space="preserve">Ouvrir le squelette de simulation </w:t>
+      </w:r>
+      <w:proofErr w:type="spellStart"/>
+      <w:r>
+        <w:t>collecteur_num.vwf</w:t>
+      </w:r>
+      <w:proofErr w:type="spellEnd"/>
+      <w:r>
+        <w:t xml:space="preserve"> et lancer une simulation fonctionnelle. Comparez aux résultats attendus</w:t>
       </w:r>
     </w:p>
     <w:p>
@@ -8278,8 +9364,13 @@
         </w:pBdr>
       </w:pPr>
       <w:r>
-        <w:t>Collez ici votre simulation de collecteur_num.vwf</w:t>
-      </w:r>
+        <w:t xml:space="preserve">Collez ici votre simulation de </w:t>
+      </w:r>
+      <w:proofErr w:type="spellStart"/>
+      <w:r>
+        <w:t>collecteur_num.vwf</w:t>
+      </w:r>
+      <w:proofErr w:type="spellEnd"/>
     </w:p>
     <w:p>
       <w:pPr>
@@ -8338,7 +9429,15 @@
         <w:jc w:val="left"/>
       </w:pPr>
       <w:r>
-        <w:t>Observez en particulier le comportement du système lorsque Hall[c,b,a] = 0 ou à 7</w:t>
+        <w:t>Observez en particulier le comportement du système lorsque Hall[</w:t>
+      </w:r>
+      <w:proofErr w:type="spellStart"/>
+      <w:r>
+        <w:t>c,b,a</w:t>
+      </w:r>
+      <w:proofErr w:type="spellEnd"/>
+      <w:r>
+        <w:t>] = 0 ou à 7</w:t>
       </w:r>
     </w:p>
     <w:p>
@@ -8358,7 +9457,15 @@
         <w:jc w:val="left"/>
       </w:pPr>
       <w:r>
-        <w:t>Observez en particulier lorsque l’entrée de validation des capteurs hall (Valid_Hall) devient inactive.</w:t>
+        <w:t>Observez en particulier lorsque l’entrée de validation des capteurs hall (</w:t>
+      </w:r>
+      <w:proofErr w:type="spellStart"/>
+      <w:r>
+        <w:t>Valid_Hall</w:t>
+      </w:r>
+      <w:proofErr w:type="spellEnd"/>
+      <w:r>
+        <w:t>) devient inactive.</w:t>
       </w:r>
     </w:p>
     <w:p/>
@@ -8376,6 +9483,7 @@
           <w:bCs/>
           <w:u w:val="single"/>
         </w:rPr>
+        <w:lastRenderedPageBreak/>
         <w:t>Création du symbole équivalent à</w:t>
       </w:r>
       <w:r>
@@ -8384,16 +9492,26 @@
           <w:bCs/>
           <w:u w:val="single"/>
         </w:rPr>
-        <w:t xml:space="preserve"> collecteur_num.</w:t>
-      </w:r>
+        <w:t xml:space="preserve"> </w:t>
+      </w:r>
+      <w:proofErr w:type="spellStart"/>
       <w:r>
         <w:rPr>
           <w:b/>
           <w:bCs/>
           <w:u w:val="single"/>
         </w:rPr>
+        <w:t>collecteur_num.</w:t>
+      </w:r>
+      <w:r>
+        <w:rPr>
+          <w:b/>
+          <w:bCs/>
+          <w:u w:val="single"/>
+        </w:rPr>
         <w:t>vhd</w:t>
       </w:r>
+      <w:proofErr w:type="spellEnd"/>
       <w:r>
         <w:rPr>
           <w:b/>
@@ -8414,14 +9532,20 @@
         <w:jc w:val="left"/>
       </w:pPr>
       <w:r>
-        <w:t>Sélectionner le fichier collecteur_num.</w:t>
+        <w:t xml:space="preserve">Sélectionner le fichier </w:t>
+      </w:r>
+      <w:proofErr w:type="spellStart"/>
+      <w:r>
+        <w:t>collecteur_num.</w:t>
       </w:r>
       <w:r>
         <w:t>vhd</w:t>
       </w:r>
+      <w:proofErr w:type="spellEnd"/>
       <w:r>
         <w:t xml:space="preserve"> et créer son symbole par défaut </w:t>
       </w:r>
+      <w:proofErr w:type="spellStart"/>
       <w:r>
         <w:rPr>
           <w:b/>
@@ -8429,6 +9553,7 @@
         </w:rPr>
         <w:t>collecteur_num.bsf</w:t>
       </w:r>
+      <w:proofErr w:type="spellEnd"/>
       <w:r>
         <w:t xml:space="preserve"> </w:t>
       </w:r>
@@ -8446,6 +9571,8 @@
       <w:r>
         <w:t xml:space="preserve">Ouvrir </w:t>
       </w:r>
+      <w:proofErr w:type="spellStart"/>
+      <w:proofErr w:type="gramStart"/>
       <w:r>
         <w:rPr>
           <w:b/>
@@ -8467,9 +9594,15 @@
         </w:rPr>
         <w:t>etudiant.bdf</w:t>
       </w:r>
-      <w:r>
-        <w:t xml:space="preserve">  et y connecter le nouveau symbole </w:t>
-      </w:r>
+      <w:proofErr w:type="spellEnd"/>
+      <w:r>
+        <w:t xml:space="preserve">  et</w:t>
+      </w:r>
+      <w:proofErr w:type="gramEnd"/>
+      <w:r>
+        <w:t xml:space="preserve"> y connecter le nouveau symbole </w:t>
+      </w:r>
+      <w:proofErr w:type="spellStart"/>
       <w:r>
         <w:rPr>
           <w:b/>
@@ -8477,6 +9610,7 @@
         </w:rPr>
         <w:t>collecteur_num.bsf</w:t>
       </w:r>
+      <w:proofErr w:type="spellEnd"/>
       <w:r>
         <w:t xml:space="preserve"> et le connecter aux E/S présentent (on remplacera le symbole déjà existant</w:t>
       </w:r>
@@ -8664,14 +9798,30 @@
           <w:numId w:val="37"/>
         </w:numPr>
       </w:pPr>
+      <w:proofErr w:type="spellStart"/>
       <w:r>
         <w:rPr>
           <w:b/>
         </w:rPr>
-        <w:t>Valid_PWM </w:t>
-      </w:r>
-      <w:r>
-        <w:t>: signal de validation global de la PWM (actif à 1) permettant de prévoir un arrêt d’urgence ou une limitation en courant par détection de sur intensité. Si Valid_PWM=0, la sortie PWM_OUT=0</w:t>
+        <w:t>Valid_PWM</w:t>
+      </w:r>
+      <w:proofErr w:type="spellEnd"/>
+      <w:r>
+        <w:rPr>
+          <w:b/>
+        </w:rPr>
+        <w:t> </w:t>
+      </w:r>
+      <w:r>
+        <w:t xml:space="preserve">: signal de validation global de la PWM (actif à 1) permettant de prévoir un arrêt d’urgence ou une limitation en courant par détection de sur intensité. Si </w:t>
+      </w:r>
+      <w:proofErr w:type="spellStart"/>
+      <w:r>
+        <w:t>Valid_PWM</w:t>
+      </w:r>
+      <w:proofErr w:type="spellEnd"/>
+      <w:r>
+        <w:t>=0, la sortie PWM_OUT=0</w:t>
       </w:r>
     </w:p>
     <w:p>
@@ -8686,10 +9836,32 @@
         <w:rPr>
           <w:b/>
         </w:rPr>
-        <w:t>PWM_REF[7..0]</w:t>
-      </w:r>
-      <w:r>
-        <w:t> : consigne PWM d’entrée fournie par le uC MBED.</w:t>
+        <w:t>PWM_REF[</w:t>
+      </w:r>
+      <w:proofErr w:type="gramStart"/>
+      <w:r>
+        <w:rPr>
+          <w:b/>
+        </w:rPr>
+        <w:t>7..</w:t>
+      </w:r>
+      <w:proofErr w:type="gramEnd"/>
+      <w:r>
+        <w:rPr>
+          <w:b/>
+        </w:rPr>
+        <w:t>0]</w:t>
+      </w:r>
+      <w:r>
+        <w:t xml:space="preserve"> : consigne PWM d’entrée fournie par le </w:t>
+      </w:r>
+      <w:proofErr w:type="spellStart"/>
+      <w:r>
+        <w:t>uC</w:t>
+      </w:r>
+      <w:proofErr w:type="spellEnd"/>
+      <w:r>
+        <w:t xml:space="preserve"> MBED.</w:t>
       </w:r>
     </w:p>
     <w:p>
@@ -8748,7 +9920,15 @@
         <w:t>PWM_OUT </w:t>
       </w:r>
       <w:r>
-        <w:t>: sortie PWM modulée en fonction de PWM_REF[7..0]</w:t>
+        <w:t>: sortie PWM modulée en fonction de PWM_REF[</w:t>
+      </w:r>
+      <w:proofErr w:type="gramStart"/>
+      <w:r>
+        <w:t>7..</w:t>
+      </w:r>
+      <w:proofErr w:type="gramEnd"/>
+      <w:r>
+        <w:t>0]</w:t>
       </w:r>
     </w:p>
     <w:p>
@@ -8932,6 +10112,8 @@
       <w:r>
         <w:t xml:space="preserve">Mettre </w:t>
       </w:r>
+      <w:proofErr w:type="spellStart"/>
+      <w:proofErr w:type="gramStart"/>
       <w:r>
         <w:rPr>
           <w:b/>
@@ -8939,8 +10121,21 @@
         </w:rPr>
         <w:t>PMW.bdf</w:t>
       </w:r>
-      <w:r>
-        <w:t xml:space="preserve">  en TopLevelEntity et lancez une compilation fonctionnelle. Corrigez les erreurs éventuelles.</w:t>
+      <w:proofErr w:type="spellEnd"/>
+      <w:r>
+        <w:t xml:space="preserve">  en</w:t>
+      </w:r>
+      <w:proofErr w:type="gramEnd"/>
+      <w:r>
+        <w:t xml:space="preserve"> </w:t>
+      </w:r>
+      <w:proofErr w:type="spellStart"/>
+      <w:r>
+        <w:t>TopLevelEntity</w:t>
+      </w:r>
+      <w:proofErr w:type="spellEnd"/>
+      <w:r>
+        <w:t xml:space="preserve"> et lancez une compilation fonctionnelle. Corrigez les erreurs éventuelles.</w:t>
       </w:r>
     </w:p>
     <w:p>
@@ -8956,6 +10151,8 @@
       <w:r>
         <w:t xml:space="preserve">Ouvrir le squelette de simulation </w:t>
       </w:r>
+      <w:proofErr w:type="spellStart"/>
+      <w:proofErr w:type="gramStart"/>
       <w:r>
         <w:rPr>
           <w:b/>
@@ -8963,8 +10160,13 @@
         </w:rPr>
         <w:t>PWM.vwf</w:t>
       </w:r>
-      <w:r>
-        <w:t xml:space="preserve">  fournis et lancer une simulation fonctionnelle. Comparez aux résultats attendus</w:t>
+      <w:proofErr w:type="spellEnd"/>
+      <w:r>
+        <w:t xml:space="preserve">  fournis</w:t>
+      </w:r>
+      <w:proofErr w:type="gramEnd"/>
+      <w:r>
+        <w:t xml:space="preserve"> et lancer une simulation fonctionnelle. Comparez aux résultats attendus</w:t>
       </w:r>
     </w:p>
     <w:p>
@@ -8980,6 +10182,7 @@
       <w:r>
         <w:t xml:space="preserve">Créer le symbole </w:t>
       </w:r>
+      <w:proofErr w:type="spellStart"/>
       <w:r>
         <w:rPr>
           <w:b/>
@@ -8987,9 +10190,11 @@
         </w:rPr>
         <w:t>PWM.bsf</w:t>
       </w:r>
+      <w:proofErr w:type="spellEnd"/>
       <w:r>
         <w:t xml:space="preserve"> équivalent à la fonction </w:t>
       </w:r>
+      <w:proofErr w:type="spellStart"/>
       <w:r>
         <w:rPr>
           <w:b/>
@@ -8997,6 +10202,7 @@
         </w:rPr>
         <w:t>PWM.bdf</w:t>
       </w:r>
+      <w:proofErr w:type="spellEnd"/>
     </w:p>
     <w:p>
       <w:pPr>
@@ -9403,7 +10609,23 @@
         <w:t>:</w:t>
       </w:r>
       <w:r>
-        <w:t xml:space="preserve"> ce bloc permet de filtrer numériquement les signaux issus des capteurs hall et qui peuvent être bruités par les signaux de puissance au moment de leur changement d’état : L’idée du filtrage est de comparer le signal hall sur 2 périodes d’horloge de base consécutives et de ne valider le signal de sortie (Valid) que lorsque le signal hall d’entrée est resté constant pendant au moins 2 périodes d horloges consécutives.</w:t>
+        <w:t xml:space="preserve"> ce bloc permet de filtrer numériquement les signaux issus des capteurs hall et qui peuvent être bruités par les signaux de puissance au moment de leur changement d’état : L’idée du filtrage est de comparer le signal hall sur 2 périodes d’horloge de base consécutives et de ne valider le signal de sortie (</w:t>
+      </w:r>
+      <w:proofErr w:type="spellStart"/>
+      <w:r>
+        <w:t>Valid</w:t>
+      </w:r>
+      <w:proofErr w:type="spellEnd"/>
+      <w:r>
+        <w:t xml:space="preserve">) que lorsque le signal hall d’entrée est resté constant pendant au moins 2 périodes </w:t>
+      </w:r>
+      <w:proofErr w:type="spellStart"/>
+      <w:r>
+        <w:t>d horloges</w:t>
+      </w:r>
+      <w:proofErr w:type="spellEnd"/>
+      <w:r>
+        <w:t xml:space="preserve"> consécutives.</w:t>
       </w:r>
     </w:p>
     <w:p>
@@ -9427,11 +10649,33 @@
           <w:numId w:val="41"/>
         </w:numPr>
       </w:pPr>
+      <w:proofErr w:type="spellStart"/>
       <w:r>
         <w:rPr>
           <w:b/>
         </w:rPr>
-        <w:t xml:space="preserve">HallA,B et HallC </w:t>
+        <w:t>HallA,B</w:t>
+      </w:r>
+      <w:proofErr w:type="spellEnd"/>
+      <w:r>
+        <w:rPr>
+          <w:b/>
+        </w:rPr>
+        <w:t xml:space="preserve"> et </w:t>
+      </w:r>
+      <w:proofErr w:type="spellStart"/>
+      <w:r>
+        <w:rPr>
+          <w:b/>
+        </w:rPr>
+        <w:t>HallC</w:t>
+      </w:r>
+      <w:proofErr w:type="spellEnd"/>
+      <w:r>
+        <w:rPr>
+          <w:b/>
+        </w:rPr>
+        <w:t xml:space="preserve"> </w:t>
       </w:r>
       <w:r>
         <w:t>sont les 3 capteurs halls de position.</w:t>
@@ -9476,14 +10720,44 @@
           <w:numId w:val="42"/>
         </w:numPr>
       </w:pPr>
+      <w:proofErr w:type="spellStart"/>
       <w:r>
         <w:rPr>
           <w:b/>
         </w:rPr>
-        <w:t>Hall_FILTRE[2..0]</w:t>
-      </w:r>
-      <w:r>
-        <w:t>. Regroupement de HallC,B et A après filtrage.</w:t>
+        <w:t>Hall_FILTRE</w:t>
+      </w:r>
+      <w:proofErr w:type="spellEnd"/>
+      <w:r>
+        <w:rPr>
+          <w:b/>
+        </w:rPr>
+        <w:t>[</w:t>
+      </w:r>
+      <w:proofErr w:type="gramStart"/>
+      <w:r>
+        <w:rPr>
+          <w:b/>
+        </w:rPr>
+        <w:t>2..</w:t>
+      </w:r>
+      <w:proofErr w:type="gramEnd"/>
+      <w:r>
+        <w:rPr>
+          <w:b/>
+        </w:rPr>
+        <w:t>0]</w:t>
+      </w:r>
+      <w:r>
+        <w:t xml:space="preserve">. Regroupement de </w:t>
+      </w:r>
+      <w:proofErr w:type="spellStart"/>
+      <w:r>
+        <w:t>HallC,B</w:t>
+      </w:r>
+      <w:proofErr w:type="spellEnd"/>
+      <w:r>
+        <w:t xml:space="preserve"> et A après filtrage.</w:t>
       </w:r>
     </w:p>
     <w:p>
@@ -9494,11 +10768,19 @@
           <w:numId w:val="42"/>
         </w:numPr>
       </w:pPr>
+      <w:proofErr w:type="spellStart"/>
       <w:r>
         <w:rPr>
           <w:b/>
         </w:rPr>
-        <w:t>Valid </w:t>
+        <w:t>Valid</w:t>
+      </w:r>
+      <w:proofErr w:type="spellEnd"/>
+      <w:r>
+        <w:rPr>
+          <w:b/>
+        </w:rPr>
+        <w:t> </w:t>
       </w:r>
       <w:r>
         <w:t xml:space="preserve">: indicateur de signal stable de l’état des capteurs hall (actif à 1). </w:t>
@@ -9513,6 +10795,7 @@
         <w:rPr>
           <w:noProof/>
         </w:rPr>
+        <w:lastRenderedPageBreak/>
         <w:drawing>
           <wp:inline distT="0" distB="0" distL="0" distR="0" wp14:anchorId="58BB58B6" wp14:editId="2CA0B99E">
             <wp:extent cx="6656705" cy="1159510"/>
@@ -9672,6 +10955,7 @@
       <w:r>
         <w:t xml:space="preserve">Mettre </w:t>
       </w:r>
+      <w:proofErr w:type="spellStart"/>
       <w:r>
         <w:rPr>
           <w:b/>
@@ -9686,8 +10970,17 @@
         </w:rPr>
         <w:t>vhd</w:t>
       </w:r>
-      <w:r>
-        <w:t xml:space="preserve"> en TopLevelEntity et lancez une compilation fonctionnelle. Corrigez les erreurs éventuelles.</w:t>
+      <w:proofErr w:type="spellEnd"/>
+      <w:r>
+        <w:t xml:space="preserve"> en </w:t>
+      </w:r>
+      <w:proofErr w:type="spellStart"/>
+      <w:r>
+        <w:t>TopLevelEntity</w:t>
+      </w:r>
+      <w:proofErr w:type="spellEnd"/>
+      <w:r>
+        <w:t xml:space="preserve"> et lancez une compilation fonctionnelle. Corrigez les erreurs éventuelles.</w:t>
       </w:r>
     </w:p>
     <w:p>
@@ -9703,6 +10996,8 @@
       <w:r>
         <w:t xml:space="preserve">Ouvrir le squelette de simulation </w:t>
       </w:r>
+      <w:proofErr w:type="spellStart"/>
+      <w:proofErr w:type="gramStart"/>
       <w:r>
         <w:rPr>
           <w:b/>
@@ -9710,8 +11005,13 @@
         </w:rPr>
         <w:t>FILTRE.vwf</w:t>
       </w:r>
-      <w:r>
-        <w:t xml:space="preserve">  fournis et lancer une simulation fonctionnelle. Comparez aux résultats attendus</w:t>
+      <w:proofErr w:type="spellEnd"/>
+      <w:r>
+        <w:t xml:space="preserve">  fournis</w:t>
+      </w:r>
+      <w:proofErr w:type="gramEnd"/>
+      <w:r>
+        <w:t xml:space="preserve"> et lancer une simulation fonctionnelle. Comparez aux résultats attendus</w:t>
       </w:r>
     </w:p>
     <w:p>
@@ -9727,6 +11027,7 @@
       <w:r>
         <w:t xml:space="preserve">Créer le symbole </w:t>
       </w:r>
+      <w:proofErr w:type="spellStart"/>
       <w:r>
         <w:rPr>
           <w:b/>
@@ -9734,9 +11035,11 @@
         </w:rPr>
         <w:t>FILTRE.bsf</w:t>
       </w:r>
+      <w:proofErr w:type="spellEnd"/>
       <w:r>
         <w:t xml:space="preserve"> équivalent à la fonction </w:t>
       </w:r>
+      <w:proofErr w:type="spellStart"/>
       <w:r>
         <w:rPr>
           <w:b/>
@@ -9751,9 +11054,11 @@
         </w:rPr>
         <w:t>vhd</w:t>
       </w:r>
+      <w:proofErr w:type="spellEnd"/>
       <w:r>
         <w:t xml:space="preserve"> et l’assembler dans le fichier général d’interconnexions </w:t>
       </w:r>
+      <w:proofErr w:type="spellStart"/>
       <w:r>
         <w:rPr>
           <w:b/>
@@ -9761,6 +11066,7 @@
         </w:rPr>
         <w:t>matrix_scooter_pwm_mbed_etudiant.bdf</w:t>
       </w:r>
+      <w:proofErr w:type="spellEnd"/>
     </w:p>
     <w:p/>
     <w:p>
@@ -9795,15 +11101,24 @@
           <w:b/>
           <w:bCs/>
         </w:rPr>
-        <w:t>de FILTRE_HALL.</w:t>
-      </w:r>
+        <w:t xml:space="preserve">de </w:t>
+      </w:r>
+      <w:proofErr w:type="spellStart"/>
       <w:r>
         <w:rPr>
           <w:b/>
           <w:bCs/>
         </w:rPr>
+        <w:t>FILTRE_HALL.</w:t>
+      </w:r>
+      <w:r>
+        <w:rPr>
+          <w:b/>
+          <w:bCs/>
+        </w:rPr>
         <w:t>vhd</w:t>
       </w:r>
+      <w:proofErr w:type="spellEnd"/>
       <w:r>
         <w:rPr>
           <w:b/>
@@ -9888,22 +11203,33 @@
           <w:b/>
           <w:bCs/>
         </w:rPr>
-        <w:t xml:space="preserve">Collez ici votre simulation fonctionnelle  </w:t>
-      </w:r>
+        <w:t xml:space="preserve">Collez ici votre simulation </w:t>
+      </w:r>
+      <w:proofErr w:type="gramStart"/>
       <w:r>
         <w:rPr>
           <w:b/>
           <w:bCs/>
         </w:rPr>
-        <w:t>FILTRE</w:t>
-      </w:r>
+        <w:t xml:space="preserve">fonctionnelle  </w:t>
+      </w:r>
+      <w:proofErr w:type="spellStart"/>
       <w:r>
         <w:rPr>
           <w:b/>
           <w:bCs/>
         </w:rPr>
+        <w:t>FILTRE</w:t>
+      </w:r>
+      <w:r>
+        <w:rPr>
+          <w:b/>
+          <w:bCs/>
+        </w:rPr>
         <w:t>.vwf</w:t>
       </w:r>
+      <w:proofErr w:type="spellEnd"/>
+      <w:proofErr w:type="gramEnd"/>
     </w:p>
     <w:p>
       <w:pPr>
@@ -9959,11 +11285,61 @@
         </w:rPr>
         <w:t xml:space="preserve">brute </w:t>
       </w:r>
+      <w:proofErr w:type="spellStart"/>
       <w:r>
         <w:rPr>
           <w:bCs/>
         </w:rPr>
-        <w:t>Halln[2..0] et la sortie filtrée Hall_filtre[2..0]</w:t>
+        <w:t>Halln</w:t>
+      </w:r>
+      <w:proofErr w:type="spellEnd"/>
+      <w:r>
+        <w:rPr>
+          <w:bCs/>
+        </w:rPr>
+        <w:t>[</w:t>
+      </w:r>
+      <w:proofErr w:type="gramStart"/>
+      <w:r>
+        <w:rPr>
+          <w:bCs/>
+        </w:rPr>
+        <w:t>2..</w:t>
+      </w:r>
+      <w:proofErr w:type="gramEnd"/>
+      <w:r>
+        <w:rPr>
+          <w:bCs/>
+        </w:rPr>
+        <w:t xml:space="preserve">0] et la sortie filtrée </w:t>
+      </w:r>
+      <w:proofErr w:type="spellStart"/>
+      <w:r>
+        <w:rPr>
+          <w:bCs/>
+        </w:rPr>
+        <w:t>Hall_filtre</w:t>
+      </w:r>
+      <w:proofErr w:type="spellEnd"/>
+      <w:r>
+        <w:rPr>
+          <w:bCs/>
+        </w:rPr>
+        <w:t>[</w:t>
+      </w:r>
+      <w:proofErr w:type="gramStart"/>
+      <w:r>
+        <w:rPr>
+          <w:bCs/>
+        </w:rPr>
+        <w:t>2..</w:t>
+      </w:r>
+      <w:proofErr w:type="gramEnd"/>
+      <w:r>
+        <w:rPr>
+          <w:bCs/>
+        </w:rPr>
+        <w:t>0]</w:t>
       </w:r>
     </w:p>
     <w:p/>
@@ -9981,7 +11357,25 @@
           <w:bCs/>
           <w:color w:val="5B9BD5" w:themeColor="accent1"/>
         </w:rPr>
-        <w:t xml:space="preserve">Etape de vérification n°1 avec une réf pwm constante: </w:t>
+        <w:t xml:space="preserve">Etape de vérification n°1 avec une réf </w:t>
+      </w:r>
+      <w:proofErr w:type="spellStart"/>
+      <w:r>
+        <w:rPr>
+          <w:b/>
+          <w:bCs/>
+          <w:color w:val="5B9BD5" w:themeColor="accent1"/>
+        </w:rPr>
+        <w:t>pwm</w:t>
+      </w:r>
+      <w:proofErr w:type="spellEnd"/>
+      <w:r>
+        <w:rPr>
+          <w:b/>
+          <w:bCs/>
+          <w:color w:val="5B9BD5" w:themeColor="accent1"/>
+        </w:rPr>
+        <w:t xml:space="preserve"> constante: </w:t>
       </w:r>
     </w:p>
     <w:p>
@@ -9995,13 +11389,29 @@
         <w:jc w:val="left"/>
       </w:pPr>
       <w:r>
-        <w:t xml:space="preserve">Placer une constante 8 bits = 127 sur l’entrée REF_PWM du bloc collecteur_num, et on validera </w:t>
+        <w:t xml:space="preserve">Placer une constante 8 bits = 127 sur l’entrée REF_PWM du bloc </w:t>
+      </w:r>
+      <w:proofErr w:type="spellStart"/>
+      <w:r>
+        <w:t>collecteur_num</w:t>
+      </w:r>
+      <w:proofErr w:type="spellEnd"/>
+      <w:r>
+        <w:t xml:space="preserve">, et on validera </w:t>
       </w:r>
       <w:r>
         <w:t xml:space="preserve">avec une entrée constante </w:t>
       </w:r>
       <w:r>
-        <w:t>à VCC en permanence l’entrée Valid_Pwm du bloc générateur PWM pour ce test.</w:t>
+        <w:t xml:space="preserve">à VCC en permanence l’entrée </w:t>
+      </w:r>
+      <w:proofErr w:type="spellStart"/>
+      <w:r>
+        <w:t>Valid_Pwm</w:t>
+      </w:r>
+      <w:proofErr w:type="spellEnd"/>
+      <w:r>
+        <w:t xml:space="preserve"> du bloc générateur PWM pour ce test.</w:t>
       </w:r>
     </w:p>
     <w:p>
@@ -10018,7 +11428,11 @@
         <w:t>Terminer les interconnexions sur le fichier général d’interconnexions</w:t>
       </w:r>
       <w:r>
-        <w:t xml:space="preserve"> m</w:t>
+        <w:t xml:space="preserve"> </w:t>
+      </w:r>
+      <w:proofErr w:type="spellStart"/>
+      <w:r>
+        <w:t>m</w:t>
       </w:r>
       <w:r>
         <w:t>atrix_</w:t>
@@ -10030,8 +11444,25 @@
         </w:rPr>
         <w:t>scooter_pwm_mbed_etudiant.bdf</w:t>
       </w:r>
-      <w:r>
-        <w:t>, le placer en top level entity et lancer une compilation générale</w:t>
+      <w:proofErr w:type="spellEnd"/>
+      <w:r>
+        <w:t xml:space="preserve">, le placer en top </w:t>
+      </w:r>
+      <w:proofErr w:type="spellStart"/>
+      <w:r>
+        <w:t>level</w:t>
+      </w:r>
+      <w:proofErr w:type="spellEnd"/>
+      <w:r>
+        <w:t xml:space="preserve"> </w:t>
+      </w:r>
+      <w:proofErr w:type="spellStart"/>
+      <w:r>
+        <w:t>entity</w:t>
+      </w:r>
+      <w:proofErr w:type="spellEnd"/>
+      <w:r>
+        <w:t xml:space="preserve"> et lancer une compilation générale</w:t>
       </w:r>
     </w:p>
     <w:p>
@@ -10045,8 +11476,17 @@
         <w:jc w:val="left"/>
       </w:pPr>
       <w:r>
-        <w:t xml:space="preserve">Programmez le PLD Altera 7064SLC44-10 avec le fichier </w:t>
-      </w:r>
+        <w:t xml:space="preserve">Programmez le PLD </w:t>
+      </w:r>
+      <w:proofErr w:type="spellStart"/>
+      <w:r>
+        <w:t>Altera</w:t>
+      </w:r>
+      <w:proofErr w:type="spellEnd"/>
+      <w:r>
+        <w:t xml:space="preserve"> 7064SLC44-10 avec le fichier </w:t>
+      </w:r>
+      <w:proofErr w:type="spellStart"/>
       <w:r>
         <w:rPr>
           <w:b/>
@@ -10054,6 +11494,7 @@
         </w:rPr>
         <w:t>pld_mbed_etudiant.pof</w:t>
       </w:r>
+      <w:proofErr w:type="spellEnd"/>
       <w:r>
         <w:t xml:space="preserve"> issue de la compilation générale.</w:t>
       </w:r>
@@ -10072,6 +11513,7 @@
         <w:rPr>
           <w:noProof/>
         </w:rPr>
+        <w:lastRenderedPageBreak/>
         <w:drawing>
           <wp:inline distT="0" distB="0" distL="0" distR="0" wp14:anchorId="62151BD6" wp14:editId="27D21B43">
             <wp:extent cx="6559550" cy="1709420"/>
@@ -10133,7 +11575,15 @@
         <w:jc w:val="left"/>
       </w:pPr>
       <w:r>
-        <w:t xml:space="preserve">Câblez la maquette SAE roue sur le moteur brushless de la roue de vélo ou de scooter et tester le fonctionnement pratique de l’autopilotage </w:t>
+        <w:t xml:space="preserve">Câblez la maquette SAE roue sur le moteur </w:t>
+      </w:r>
+      <w:proofErr w:type="spellStart"/>
+      <w:r>
+        <w:t>brushless</w:t>
+      </w:r>
+      <w:proofErr w:type="spellEnd"/>
+      <w:r>
+        <w:t xml:space="preserve"> de la roue de vélo ou de scooter et tester le fonctionnement pratique de l’autopilotage </w:t>
       </w:r>
       <w:r>
         <w:t>. La roue doit se mettre à tourner.</w:t>
@@ -10144,11 +11594,21 @@
         <w:pStyle w:val="Titre2"/>
       </w:pPr>
       <w:r>
-        <w:t xml:space="preserve">Bloc de communication PLD/uC </w:t>
-      </w:r>
+        <w:t>Bloc de communication PLD/</w:t>
+      </w:r>
+      <w:proofErr w:type="spellStart"/>
+      <w:r>
+        <w:t>uC</w:t>
+      </w:r>
+      <w:proofErr w:type="spellEnd"/>
+      <w:r>
+        <w:t xml:space="preserve"> </w:t>
+      </w:r>
+      <w:proofErr w:type="spellStart"/>
       <w:r>
         <w:t>Mbed</w:t>
       </w:r>
+      <w:proofErr w:type="spellEnd"/>
     </w:p>
     <w:p>
       <w:r>
@@ -10234,22 +11694,56 @@
         <w:t xml:space="preserve">entièrement </w:t>
       </w:r>
       <w:r>
-        <w:t>fourni en code source VHDL) permet l’échange bidirectionnel de mots de 8 bits // entre le PLD Altera et le uC Beck.</w:t>
-      </w:r>
-    </w:p>
-    <w:p>
-      <w:r>
-        <w:t xml:space="preserve">En effet le PLD Altera est implanté sur le bus </w:t>
-      </w:r>
-      <w:r>
-        <w:t xml:space="preserve">d’E/S // 8 bits </w:t>
-      </w:r>
-      <w:r>
-        <w:t xml:space="preserve"> du </w:t>
-      </w:r>
+        <w:t xml:space="preserve">fourni en code source VHDL) permet l’échange bidirectionnel de mots de 8 bits // entre le PLD </w:t>
+      </w:r>
+      <w:proofErr w:type="spellStart"/>
+      <w:r>
+        <w:t>Altera</w:t>
+      </w:r>
+      <w:proofErr w:type="spellEnd"/>
+      <w:r>
+        <w:t xml:space="preserve"> et le </w:t>
+      </w:r>
+      <w:proofErr w:type="spellStart"/>
+      <w:r>
+        <w:t>uC</w:t>
+      </w:r>
+      <w:proofErr w:type="spellEnd"/>
+      <w:r>
+        <w:t xml:space="preserve"> Beck.</w:t>
+      </w:r>
+    </w:p>
+    <w:p>
+      <w:r>
+        <w:t xml:space="preserve">En effet le PLD </w:t>
+      </w:r>
+      <w:proofErr w:type="spellStart"/>
+      <w:r>
+        <w:t>Altera</w:t>
+      </w:r>
+      <w:proofErr w:type="spellEnd"/>
+      <w:r>
+        <w:t xml:space="preserve"> est implanté sur le bus </w:t>
+      </w:r>
+      <w:r>
+        <w:t xml:space="preserve">d’E/S // 8 </w:t>
+      </w:r>
+      <w:proofErr w:type="gramStart"/>
+      <w:r>
+        <w:t xml:space="preserve">bits </w:t>
+      </w:r>
+      <w:r>
+        <w:t xml:space="preserve"> du</w:t>
+      </w:r>
+      <w:proofErr w:type="gramEnd"/>
+      <w:r>
+        <w:t xml:space="preserve"> </w:t>
+      </w:r>
+      <w:proofErr w:type="spellStart"/>
       <w:r>
         <w:t>Mbed</w:t>
       </w:r>
+      <w:proofErr w:type="spellEnd"/>
       <w:r>
         <w:t xml:space="preserve"> et donc</w:t>
       </w:r>
@@ -10263,15 +11757,79 @@
         <w:t xml:space="preserve"> de fonction </w:t>
       </w:r>
       <w:r>
-        <w:t xml:space="preserve">présente au projet </w:t>
-      </w:r>
-      <w:r>
-        <w:t xml:space="preserve"> port.c et port.h et la fonction PIO_Read() ) le PLD lui retourne un vecteur de 8 bits DATA_IN[7..0].</w:t>
-      </w:r>
-    </w:p>
-    <w:p>
-      <w:r>
-        <w:t>De la même façon, si le uC tente une écriture dans cette plage d'adresse (PIO_Write()), la valeur écrite se retrouve disponible dans le PLD sur le vecteur DATA_OUT[7..0].</w:t>
+        <w:t xml:space="preserve">présente au </w:t>
+      </w:r>
+      <w:proofErr w:type="gramStart"/>
+      <w:r>
+        <w:t xml:space="preserve">projet </w:t>
+      </w:r>
+      <w:r>
+        <w:t xml:space="preserve"> </w:t>
+      </w:r>
+      <w:proofErr w:type="spellStart"/>
+      <w:r>
+        <w:t>port</w:t>
+      </w:r>
+      <w:proofErr w:type="gramEnd"/>
+      <w:r>
+        <w:t>.c</w:t>
+      </w:r>
+      <w:proofErr w:type="spellEnd"/>
+      <w:r>
+        <w:t xml:space="preserve"> et </w:t>
+      </w:r>
+      <w:proofErr w:type="spellStart"/>
+      <w:r>
+        <w:t>port.h</w:t>
+      </w:r>
+      <w:proofErr w:type="spellEnd"/>
+      <w:r>
+        <w:t xml:space="preserve"> et la fonction </w:t>
+      </w:r>
+      <w:proofErr w:type="spellStart"/>
+      <w:r>
+        <w:t>PIO_Read</w:t>
+      </w:r>
+      <w:proofErr w:type="spellEnd"/>
+      <w:r>
+        <w:t>() ) le PLD lui retourne un vecteur de 8 bits DATA_IN[</w:t>
+      </w:r>
+      <w:proofErr w:type="gramStart"/>
+      <w:r>
+        <w:t>7..</w:t>
+      </w:r>
+      <w:proofErr w:type="gramEnd"/>
+      <w:r>
+        <w:t>0].</w:t>
+      </w:r>
+    </w:p>
+    <w:p>
+      <w:r>
+        <w:t xml:space="preserve">De la même façon, si le </w:t>
+      </w:r>
+      <w:proofErr w:type="spellStart"/>
+      <w:r>
+        <w:t>uC</w:t>
+      </w:r>
+      <w:proofErr w:type="spellEnd"/>
+      <w:r>
+        <w:t xml:space="preserve"> tente une écriture dans cette plage d'adresse (</w:t>
+      </w:r>
+      <w:proofErr w:type="spellStart"/>
+      <w:r>
+        <w:t>PIO_Write</w:t>
+      </w:r>
+      <w:proofErr w:type="spellEnd"/>
+      <w:r>
+        <w:t>()), la valeur écrite se retrouve disponible dans le PLD sur le vecteur DATA_OUT[</w:t>
+      </w:r>
+      <w:proofErr w:type="gramStart"/>
+      <w:r>
+        <w:t>7..</w:t>
+      </w:r>
+      <w:proofErr w:type="gramEnd"/>
+      <w:r>
+        <w:t>0].</w:t>
       </w:r>
     </w:p>
     <w:p/>
@@ -10288,7 +11846,15 @@
         <w:pStyle w:val="Titre2"/>
       </w:pPr>
       <w:r>
-        <w:t>Autopilotage de la roue à partie du PLD Altera seul et d’une consigne de PWM fixée en dur à l’</w:t>
+        <w:t xml:space="preserve">Autopilotage de la roue à partie du PLD </w:t>
+      </w:r>
+      <w:proofErr w:type="spellStart"/>
+      <w:r>
+        <w:t>Altera</w:t>
+      </w:r>
+      <w:proofErr w:type="spellEnd"/>
+      <w:r>
+        <w:t xml:space="preserve"> seul et d’une consigne de PWM fixée en dur à l’</w:t>
       </w:r>
       <w:r>
         <w:t>intérieur</w:t>
@@ -10299,7 +11865,15 @@
     </w:p>
     <w:p>
       <w:r>
-        <w:t xml:space="preserve">Il s’agit de désigner l’architecture interne du PLD pour que ce dernier puisse permettre de faire tourner la roue en marche avant ou en marche arrière (à partir de la lecture du bit de Direction) à vitesse constante (ref_pwm fixée en dur à 127 puis 255 à </w:t>
+        <w:t>Il s’agit de désigner l’architecture interne du PLD pour que ce dernier puisse permettre de faire tourner la roue en marche avant ou en marche arrière (à partir de la lecture du bit de Direction) à vitesse constante (</w:t>
+      </w:r>
+      <w:proofErr w:type="spellStart"/>
+      <w:r>
+        <w:t>ref_pwm</w:t>
+      </w:r>
+      <w:proofErr w:type="spellEnd"/>
+      <w:r>
+        <w:t xml:space="preserve"> fixée en dur à 127 puis 255 à </w:t>
       </w:r>
       <w:r>
         <w:t>l’intérieur</w:t>
@@ -10338,8 +11912,34 @@
         <w:pStyle w:val="Titre2"/>
       </w:pPr>
       <w:r>
-        <w:t>Autopilotage de la roue à partie du PLD Altera  et d’une consigne de PWM fournie par le uC MBED à partir d’une saisie console utilisateur..</w:t>
-      </w:r>
+        <w:t xml:space="preserve">Autopilotage de la roue à partie du PLD </w:t>
+      </w:r>
+      <w:proofErr w:type="spellStart"/>
+      <w:proofErr w:type="gramStart"/>
+      <w:r>
+        <w:t>Altera</w:t>
+      </w:r>
+      <w:proofErr w:type="spellEnd"/>
+      <w:r>
+        <w:t xml:space="preserve">  et</w:t>
+      </w:r>
+      <w:proofErr w:type="gramEnd"/>
+      <w:r>
+        <w:t xml:space="preserve"> d’une consigne de PWM fournie par le </w:t>
+      </w:r>
+      <w:proofErr w:type="spellStart"/>
+      <w:r>
+        <w:t>uC</w:t>
+      </w:r>
+      <w:proofErr w:type="spellEnd"/>
+      <w:r>
+        <w:t xml:space="preserve"> MBED à partir d’une saisie console </w:t>
+      </w:r>
+      <w:proofErr w:type="gramStart"/>
+      <w:r>
+        <w:t>utilisateur..</w:t>
+      </w:r>
+      <w:proofErr w:type="gramEnd"/>
     </w:p>
     <w:p>
       <w:r>
@@ -10349,7 +11949,15 @@
         <w:t>reçoive</w:t>
       </w:r>
       <w:r>
-        <w:t xml:space="preserve"> sa consigne REF_PWM en provenance du uC MBED via la liaison de communication 8bits bidirectionnelle </w:t>
+        <w:t xml:space="preserve"> sa consigne REF_PWM en provenance du </w:t>
+      </w:r>
+      <w:proofErr w:type="spellStart"/>
+      <w:r>
+        <w:t>uC</w:t>
+      </w:r>
+      <w:proofErr w:type="spellEnd"/>
+      <w:r>
+        <w:t xml:space="preserve"> MBED via la liaison de communication 8bits bidirectionnelle </w:t>
       </w:r>
       <w:r>
         <w:t xml:space="preserve">déjà </w:t>
@@ -10363,10 +11971,18 @@
         <w:t xml:space="preserve">Coté MBED, importer le squelette </w:t>
       </w:r>
       <w:r>
-        <w:t xml:space="preserve">du programme du </w:t>
-      </w:r>
-      <w:r>
-        <w:t xml:space="preserve"> projet MBED depuis l’environnement cloud via le lien suivant</w:t>
+        <w:t xml:space="preserve">du programme </w:t>
+      </w:r>
+      <w:proofErr w:type="gramStart"/>
+      <w:r>
+        <w:t xml:space="preserve">du </w:t>
+      </w:r>
+      <w:r>
+        <w:t xml:space="preserve"> projet</w:t>
+      </w:r>
+      <w:proofErr w:type="gramEnd"/>
+      <w:r>
+        <w:t xml:space="preserve"> MBED depuis l’environnement cloud via le lien suivant</w:t>
       </w:r>
       <w:r>
         <w:t>:</w:t>
@@ -10404,10 +12020,34 @@
     </w:p>
     <w:p>
       <w:r>
-        <w:t>L’objectif du programme qui sera implanté dans le uC MBED  est de permettre, via un petit menu console série (IHM atelier</w:t>
-      </w:r>
-      <w:r>
-        <w:t xml:space="preserve"> voir figure 5-1 </w:t>
+        <w:t xml:space="preserve">L’objectif du programme qui sera implanté dans le </w:t>
+      </w:r>
+      <w:proofErr w:type="spellStart"/>
+      <w:r>
+        <w:t>uC</w:t>
+      </w:r>
+      <w:proofErr w:type="spellEnd"/>
+      <w:r>
+        <w:t xml:space="preserve"> </w:t>
+      </w:r>
+      <w:proofErr w:type="gramStart"/>
+      <w:r>
+        <w:t>MBED  est</w:t>
+      </w:r>
+      <w:proofErr w:type="gramEnd"/>
+      <w:r>
+        <w:t xml:space="preserve"> de permettre, via un petit menu console série (IHM atelier</w:t>
+      </w:r>
+      <w:r>
+        <w:t xml:space="preserve"> </w:t>
+      </w:r>
+      <w:proofErr w:type="gramStart"/>
+      <w:r>
+        <w:t>voir</w:t>
+      </w:r>
+      <w:proofErr w:type="gramEnd"/>
+      <w:r>
+        <w:t xml:space="preserve"> figure 5-1 </w:t>
       </w:r>
       <w:r>
         <w:t xml:space="preserve">)  en liaison RS232, </w:t>
@@ -10427,13 +12067,29 @@
     </w:p>
     <w:p>
       <w:r>
-        <w:t>Dans cette étape c est uniquement la consigne de PWM qui devra être saisie par l</w:t>
+        <w:t xml:space="preserve">Dans cette étape </w:t>
+      </w:r>
+      <w:proofErr w:type="spellStart"/>
+      <w:r>
+        <w:t>c est</w:t>
+      </w:r>
+      <w:proofErr w:type="spellEnd"/>
+      <w:r>
+        <w:t xml:space="preserve"> uniquement la consigne de PWM qui devra être saisie par l</w:t>
       </w:r>
       <w:r>
         <w:t>’</w:t>
       </w:r>
       <w:r>
-        <w:t xml:space="preserve">utilisateur ce qui caractérisera le MODE MANUEL. C’est un  mode uniquement </w:t>
+        <w:t xml:space="preserve">utilisateur ce qui caractérisera le MODE MANUEL. C’est </w:t>
+      </w:r>
+      <w:proofErr w:type="gramStart"/>
+      <w:r>
+        <w:t>un  mode</w:t>
+      </w:r>
+      <w:proofErr w:type="gramEnd"/>
+      <w:r>
+        <w:t xml:space="preserve"> uniquement </w:t>
       </w:r>
       <w:r>
         <w:t>accessible</w:t>
@@ -10512,6 +12168,9 @@
           </wp:inline>
         </w:drawing>
       </w:r>
+      <w:r>
+        <w:tab/>
+      </w:r>
     </w:p>
     <w:p>
       <w:pPr>
@@ -10546,7 +12205,23 @@
     </w:p>
     <w:p>
       <w:r>
-        <w:t xml:space="preserve">Ce menu console sera géré en tache de fond dans le Main(). On pourra en sortir en tapant la lettre ‘q’ (quit) ce qui provoquer la mise à 0 de la REF_PWM et la  dévalidation générale du générateur PWM implanté dans le PLD. Pour cela vous utiliser le bit de </w:t>
+        <w:t>Ce menu console sera géré en tache de fond dans le Main(). On pourra en sortir en tapant la lettre ‘q’ (</w:t>
+      </w:r>
+      <w:proofErr w:type="spellStart"/>
+      <w:r>
+        <w:t>quit</w:t>
+      </w:r>
+      <w:proofErr w:type="spellEnd"/>
+      <w:r>
+        <w:t xml:space="preserve">) ce qui provoquer la mise à 0 de la REF_PWM et </w:t>
+      </w:r>
+      <w:proofErr w:type="gramStart"/>
+      <w:r>
+        <w:t>la  dévalidation</w:t>
+      </w:r>
+      <w:proofErr w:type="gramEnd"/>
+      <w:r>
+        <w:t xml:space="preserve"> générale du générateur PWM implanté dans le PLD. Pour cela vous utiliser le bit de </w:t>
       </w:r>
       <w:r>
         <w:t>liaison</w:t>
@@ -10563,7 +12238,23 @@
     </w:p>
     <w:p>
       <w:r>
-        <w:t>L’envoie de cette référence REF_PWM depuis le uC MBED vers le PLD Altera se fera en utilisant une API déjà présente dans le squelette du projet et détaillée dans la fiche ressource FICHE 3.</w:t>
+        <w:t xml:space="preserve">L’envoie de cette référence REF_PWM depuis le </w:t>
+      </w:r>
+      <w:proofErr w:type="spellStart"/>
+      <w:r>
+        <w:t>uC</w:t>
+      </w:r>
+      <w:proofErr w:type="spellEnd"/>
+      <w:r>
+        <w:t xml:space="preserve"> MBED vers le PLD </w:t>
+      </w:r>
+      <w:proofErr w:type="spellStart"/>
+      <w:r>
+        <w:t>Altera</w:t>
+      </w:r>
+      <w:proofErr w:type="spellEnd"/>
+      <w:r>
+        <w:t xml:space="preserve"> se fera en utilisant une API déjà présente dans le squelette du projet et détaillée dans la fiche ressource FICHE 3.</w:t>
       </w:r>
     </w:p>
     <w:p>
@@ -10581,10 +12272,18 @@
         <w:t>la possibilité de saisir</w:t>
       </w:r>
       <w:r>
-        <w:t xml:space="preserve"> manuellement </w:t>
-      </w:r>
-      <w:r>
-        <w:t xml:space="preserve"> un rapport cyclique</w:t>
+        <w:t xml:space="preserve"> </w:t>
+      </w:r>
+      <w:proofErr w:type="gramStart"/>
+      <w:r>
+        <w:t xml:space="preserve">manuellement </w:t>
+      </w:r>
+      <w:r>
+        <w:t xml:space="preserve"> un</w:t>
+      </w:r>
+      <w:proofErr w:type="gramEnd"/>
+      <w:r>
+        <w:t xml:space="preserve"> rapport cyclique</w:t>
       </w:r>
       <w:r>
         <w:t xml:space="preserve"> compris entre 0 et 255.</w:t>
@@ -10665,28 +12364,93 @@
     </w:p>
     <w:p>
       <w:r>
-        <w:t>Il s’agira cette fois d’exploiter les informations des capteurs de position du moteur brushless pour obtenir une mesure précise de la vitesse de rotation et la mettre à disposition de l’affichage dans la console.</w:t>
-      </w:r>
-    </w:p>
-    <w:p>
-      <w:r>
-        <w:t xml:space="preserve">Pour cela vous disposez d’un signal Valid_HALL (voir tableau d’affectation en figure 3) et présent sur le MBED sur P22. Ce signal présente un front montant à chaque changement de secteur d’alimentation du moteur brushless. </w:t>
-      </w:r>
-    </w:p>
-    <w:p>
-      <w:r>
-        <w:t>Visualiser ce signal Valid_Hall  sur le uC MBED (mesure à effectuer à l’oscilloscope avec une sonde) et mesurer la relation Fréquence Valid_Hall=F(vitesse de la roue).</w:t>
-      </w:r>
-    </w:p>
-    <w:p>
-      <w:r>
+        <w:t xml:space="preserve">Il s’agira cette fois d’exploiter les informations des capteurs de position du moteur </w:t>
+      </w:r>
+      <w:proofErr w:type="spellStart"/>
+      <w:r>
+        <w:t>brushless</w:t>
+      </w:r>
+      <w:proofErr w:type="spellEnd"/>
+      <w:r>
+        <w:t xml:space="preserve"> pour obtenir une mesure précise de la vitesse de rotation et la mettre à disposition de l’affichage dans la console.</w:t>
+      </w:r>
+    </w:p>
+    <w:p>
+      <w:r>
+        <w:t xml:space="preserve">Pour cela vous disposez d’un signal </w:t>
+      </w:r>
+      <w:proofErr w:type="spellStart"/>
+      <w:r>
+        <w:t>Valid_HALL</w:t>
+      </w:r>
+      <w:proofErr w:type="spellEnd"/>
+      <w:r>
+        <w:t xml:space="preserve"> (voir tableau d’affectation en figure 3) et présent sur le MBED sur P22. Ce signal présente un front montant à chaque changement de secteur d’alimentation du moteur </w:t>
+      </w:r>
+      <w:proofErr w:type="spellStart"/>
+      <w:r>
+        <w:t>brushless</w:t>
+      </w:r>
+      <w:proofErr w:type="spellEnd"/>
+      <w:r>
+        <w:t xml:space="preserve">. </w:t>
+      </w:r>
+    </w:p>
+    <w:p>
+      <w:r>
+        <w:t xml:space="preserve">Visualiser ce signal </w:t>
+      </w:r>
+      <w:proofErr w:type="spellStart"/>
+      <w:r>
+        <w:t>Valid_</w:t>
+      </w:r>
+      <w:proofErr w:type="gramStart"/>
+      <w:r>
+        <w:t>Hall</w:t>
+      </w:r>
+      <w:proofErr w:type="spellEnd"/>
+      <w:r>
+        <w:t xml:space="preserve">  sur</w:t>
+      </w:r>
+      <w:proofErr w:type="gramEnd"/>
+      <w:r>
+        <w:t xml:space="preserve"> le </w:t>
+      </w:r>
+      <w:proofErr w:type="spellStart"/>
+      <w:r>
+        <w:t>uC</w:t>
+      </w:r>
+      <w:proofErr w:type="spellEnd"/>
+      <w:r>
+        <w:t xml:space="preserve"> MBED (mesure à effectuer à l’oscilloscope avec une sonde) et mesurer la relation Fréquence </w:t>
+      </w:r>
+      <w:proofErr w:type="spellStart"/>
+      <w:r>
+        <w:t>Valid_Hall</w:t>
+      </w:r>
+      <w:proofErr w:type="spellEnd"/>
+      <w:r>
+        <w:t>=F(vitesse de la roue).</w:t>
+      </w:r>
+    </w:p>
+    <w:p>
+      <w:r>
+        <w:lastRenderedPageBreak/>
         <w:t>Connaissant les paramètres de construction de la roue et, le nombre de secteur d’alimentation différent</w:t>
       </w:r>
       <w:r>
-        <w:t xml:space="preserve">s nécessaire </w:t>
-      </w:r>
-      <w:r>
-        <w:t xml:space="preserve"> pour faire un tour </w:t>
+        <w:t xml:space="preserve">s </w:t>
+      </w:r>
+      <w:proofErr w:type="gramStart"/>
+      <w:r>
+        <w:t xml:space="preserve">nécessaire </w:t>
+      </w:r>
+      <w:r>
+        <w:t xml:space="preserve"> pour</w:t>
+      </w:r>
+      <w:proofErr w:type="gramEnd"/>
+      <w:r>
+        <w:t xml:space="preserve"> faire un tour </w:t>
       </w:r>
       <w:r>
         <w:t>électrique</w:t>
@@ -10707,12 +12471,28 @@
         <w:t>diamètre</w:t>
       </w:r>
       <w:r>
-        <w:t xml:space="preserve"> en déduire la période de comptage de ces top de Valid_Hall pour obtenir au minimum une précision de mesure de vitesse de 1KM/H soit pour le moteur de vélo soit pour le moteur de scooter.</w:t>
-      </w:r>
-    </w:p>
-    <w:p>
-      <w:r>
-        <w:t>Etablir ensuite la relation Vitesse=F(nb_top) en utilisant une période de comptage de ces tops de 100ms (période qui sera implantée dans le logiciel final). Les paramètres électrique (p=nombre paires de de pôles/phase) géométrique (</w:t>
+        <w:t xml:space="preserve"> en déduire la période de comptage de ces top de </w:t>
+      </w:r>
+      <w:proofErr w:type="spellStart"/>
+      <w:r>
+        <w:t>Valid_Hall</w:t>
+      </w:r>
+      <w:proofErr w:type="spellEnd"/>
+      <w:r>
+        <w:t xml:space="preserve"> pour obtenir au minimum une précision de mesure de vitesse de 1KM/H soit pour le moteur de vélo soit pour le moteur de scooter.</w:t>
+      </w:r>
+    </w:p>
+    <w:p>
+      <w:r>
+        <w:t>Etablir ensuite la relation Vitesse=F(</w:t>
+      </w:r>
+      <w:proofErr w:type="spellStart"/>
+      <w:r>
+        <w:t>nb_top</w:t>
+      </w:r>
+      <w:proofErr w:type="spellEnd"/>
+      <w:r>
+        <w:t>) en utilisant une période de comptage de ces tops de 100ms (période qui sera implantée dans le logiciel final). Les paramètres électrique (p=nombre paires de de pôles/phase) géométrique (</w:t>
       </w:r>
       <w:r>
         <w:t>diamètre</w:t>
@@ -10753,11 +12533,24 @@
       <w:r>
         <w:t xml:space="preserve">Réalisation d’un programme de test pour le réglage de la </w:t>
       </w:r>
-      <w:r>
-        <w:t xml:space="preserve">Ref_PWM </w:t>
-      </w:r>
-      <w:r>
-        <w:t xml:space="preserve"> depuis la poignée </w:t>
+      <w:proofErr w:type="spellStart"/>
+      <w:r>
+        <w:t>Ref_</w:t>
+      </w:r>
+      <w:proofErr w:type="gramStart"/>
+      <w:r>
+        <w:t>PWM</w:t>
+      </w:r>
+      <w:proofErr w:type="spellEnd"/>
+      <w:r>
+        <w:t xml:space="preserve"> </w:t>
+      </w:r>
+      <w:r>
+        <w:t xml:space="preserve"> depuis</w:t>
+      </w:r>
+      <w:proofErr w:type="gramEnd"/>
+      <w:r>
+        <w:t xml:space="preserve"> la poignée </w:t>
       </w:r>
       <w:r>
         <w:t>de Gaz</w:t>
@@ -10765,12 +12558,36 @@
     </w:p>
     <w:p>
       <w:r>
-        <w:t>Le contrôleur de VAE est capable de lire une consigne analogique représentant la consigne de vitesse de la roue. Cette entrée analogique Vgaz est disponible sur la broche P17 du uC MBED (voir figure 3) .</w:t>
-      </w:r>
-    </w:p>
-    <w:p>
-      <w:r>
-        <w:t>Réfléchir à une architecture logicielle susceptible de procéder à  la lecture de cette consigne analogique en dehors du menu déroulant (ce dernier étant bloquant en attente d’un choix utilisateur)</w:t>
+        <w:t xml:space="preserve">Le contrôleur de VAE est capable de lire une consigne analogique représentant la consigne de vitesse de la roue. Cette entrée analogique </w:t>
+      </w:r>
+      <w:proofErr w:type="spellStart"/>
+      <w:r>
+        <w:t>Vgaz</w:t>
+      </w:r>
+      <w:proofErr w:type="spellEnd"/>
+      <w:r>
+        <w:t xml:space="preserve"> est disponible sur la broche P17 du </w:t>
+      </w:r>
+      <w:proofErr w:type="spellStart"/>
+      <w:r>
+        <w:t>uC</w:t>
+      </w:r>
+      <w:proofErr w:type="spellEnd"/>
+      <w:r>
+        <w:t xml:space="preserve"> MBED (voir figure 3) .</w:t>
+      </w:r>
+    </w:p>
+    <w:p>
+      <w:r>
+        <w:t xml:space="preserve">Réfléchir à une architecture logicielle susceptible de procéder </w:t>
+      </w:r>
+      <w:proofErr w:type="gramStart"/>
+      <w:r>
+        <w:t>à  la</w:t>
+      </w:r>
+      <w:proofErr w:type="gramEnd"/>
+      <w:r>
+        <w:t xml:space="preserve"> lecture de cette consigne analogique en dehors du menu déroulant (ce dernier étant bloquant en attente d’un choix utilisateur)</w:t>
       </w:r>
     </w:p>
     <w:p>
@@ -10801,8 +12618,13 @@
       <w:r>
         <w:t xml:space="preserve">Mode Auto (mode par défaut au démarrage) la consigne </w:t>
       </w:r>
-      <w:r>
-        <w:t xml:space="preserve">Ref_PWM </w:t>
+      <w:proofErr w:type="spellStart"/>
+      <w:r>
+        <w:t>Ref_PWM</w:t>
+      </w:r>
+      <w:proofErr w:type="spellEnd"/>
+      <w:r>
+        <w:t xml:space="preserve"> </w:t>
       </w:r>
       <w:r>
         <w:t>est issue de la poignée de Gaz</w:t>
@@ -10839,20 +12661,110 @@
         <w:t> </w:t>
       </w:r>
       <w:r>
-        <w:t>: relevez avec un oscilloscope la variation de la tension Vgaz en fonction des positions extrêmes de la poignées de Gaz. Déterminer les deux positions extrêmes de Vgaz à savoir Vgaz_Min (poignée au minimum) et Vgaz_Max (poignée au maximum). Comparez les paramètres à ceux mesurés par les autres binômes pour estimer la dispersion de ces caractéristiques</w:t>
-      </w:r>
-    </w:p>
-    <w:p>
-      <w:r>
-        <w:t xml:space="preserve">En déduite la relation en mode Auto :  Ref_PWM_AUTO=F (Vgaz, Vgaz_min, Vgaz_max) et la représenter graphiquement. Pensez à intégrer à votre logiciel une saturation de la valeur Ref_Pwm_AUTO afin de garantir que la consigne envoyée au PLD restera bien entre 0 et 255. </w:t>
-      </w:r>
-    </w:p>
-    <w:p>
-      <w:r>
-        <w:t xml:space="preserve">Pensez a gérer </w:t>
-      </w:r>
-      <w:r>
-        <w:t>le capteur de frein pour couper instantanément la consigne d’assistance electrique en cas de freinage.</w:t>
+        <w:t xml:space="preserve">: relevez avec un oscilloscope la variation de la tension </w:t>
+      </w:r>
+      <w:proofErr w:type="spellStart"/>
+      <w:r>
+        <w:t>Vgaz</w:t>
+      </w:r>
+      <w:proofErr w:type="spellEnd"/>
+      <w:r>
+        <w:t xml:space="preserve"> en fonction des positions extrêmes de la poignées de Gaz. Déterminer les deux positions extrêmes de </w:t>
+      </w:r>
+      <w:proofErr w:type="spellStart"/>
+      <w:r>
+        <w:t>Vgaz</w:t>
+      </w:r>
+      <w:proofErr w:type="spellEnd"/>
+      <w:r>
+        <w:t xml:space="preserve"> à savoir </w:t>
+      </w:r>
+      <w:proofErr w:type="spellStart"/>
+      <w:r>
+        <w:t>Vgaz_Min</w:t>
+      </w:r>
+      <w:proofErr w:type="spellEnd"/>
+      <w:r>
+        <w:t xml:space="preserve"> (poignée au minimum) et </w:t>
+      </w:r>
+      <w:proofErr w:type="spellStart"/>
+      <w:r>
+        <w:t>Vgaz_Max</w:t>
+      </w:r>
+      <w:proofErr w:type="spellEnd"/>
+      <w:r>
+        <w:t xml:space="preserve"> (poignée au maximum). Comparez les paramètres à ceux mesurés par les autres binômes pour estimer la dispersion de ces caractéristiques</w:t>
+      </w:r>
+    </w:p>
+    <w:p>
+      <w:r>
+        <w:t xml:space="preserve">En déduite la relation en mode Auto :  </w:t>
+      </w:r>
+      <w:proofErr w:type="spellStart"/>
+      <w:r>
+        <w:t>Ref_PWM_AUTO</w:t>
+      </w:r>
+      <w:proofErr w:type="spellEnd"/>
+      <w:r>
+        <w:t>=F (</w:t>
+      </w:r>
+      <w:proofErr w:type="spellStart"/>
+      <w:r>
+        <w:t>Vgaz</w:t>
+      </w:r>
+      <w:proofErr w:type="spellEnd"/>
+      <w:r>
+        <w:t xml:space="preserve">, </w:t>
+      </w:r>
+      <w:proofErr w:type="spellStart"/>
+      <w:r>
+        <w:t>Vgaz_min</w:t>
+      </w:r>
+      <w:proofErr w:type="spellEnd"/>
+      <w:r>
+        <w:t xml:space="preserve">, </w:t>
+      </w:r>
+      <w:proofErr w:type="spellStart"/>
+      <w:r>
+        <w:t>Vgaz_max</w:t>
+      </w:r>
+      <w:proofErr w:type="spellEnd"/>
+      <w:r>
+        <w:t xml:space="preserve">) et la représenter graphiquement. Pensez à intégrer à votre logiciel une saturation de la valeur </w:t>
+      </w:r>
+      <w:proofErr w:type="spellStart"/>
+      <w:r>
+        <w:t>Ref_Pwm_AUTO</w:t>
+      </w:r>
+      <w:proofErr w:type="spellEnd"/>
+      <w:r>
+        <w:t xml:space="preserve"> afin de garantir que la consigne envoyée au PLD restera bien entre 0 et 255. </w:t>
+      </w:r>
+    </w:p>
+    <w:p>
+      <w:r>
+        <w:t xml:space="preserve">Pensez </w:t>
+      </w:r>
+      <w:proofErr w:type="spellStart"/>
+      <w:proofErr w:type="gramStart"/>
+      <w:r>
+        <w:t>a</w:t>
+      </w:r>
+      <w:proofErr w:type="spellEnd"/>
+      <w:proofErr w:type="gramEnd"/>
+      <w:r>
+        <w:t xml:space="preserve"> gérer </w:t>
+      </w:r>
+      <w:r>
+        <w:t xml:space="preserve">le capteur de frein pour couper instantanément la consigne d’assistance </w:t>
+      </w:r>
+      <w:proofErr w:type="spellStart"/>
+      <w:r>
+        <w:t>electrique</w:t>
+      </w:r>
+      <w:proofErr w:type="spellEnd"/>
+      <w:r>
+        <w:t xml:space="preserve"> en cas de freinage.</w:t>
       </w:r>
     </w:p>
     <w:p>
@@ -10865,7 +12777,23 @@
     </w:p>
     <w:p>
       <w:r>
-        <w:t xml:space="preserve">Faire valider le fonctionnement du mode auto avec la  gestion du frein (la consigne REF_PWM doit tomber à 0 quelque soit la position de la poignée de Gaz si le frein est actif. </w:t>
+        <w:t xml:space="preserve">Faire valider le fonctionnement du mode auto avec </w:t>
+      </w:r>
+      <w:proofErr w:type="gramStart"/>
+      <w:r>
+        <w:t>la  gestion</w:t>
+      </w:r>
+      <w:proofErr w:type="gramEnd"/>
+      <w:r>
+        <w:t xml:space="preserve"> du frein (la consigne REF_PWM doit tomber à 0 </w:t>
+      </w:r>
+      <w:proofErr w:type="spellStart"/>
+      <w:r>
+        <w:t>quelque</w:t>
+      </w:r>
+      <w:proofErr w:type="spellEnd"/>
+      <w:r>
+        <w:t xml:space="preserve"> soit la position de la poignée de Gaz si le frein est actif. </w:t>
       </w:r>
     </w:p>
     <w:p>
@@ -10884,7 +12812,23 @@
         <w:t>4</w:t>
       </w:r>
       <w:r>
-        <w:t xml:space="preserve">.5 on rajoutera une option au menu déroulant permettant de relever et archiver les paramètres de calibration de la pignée de Gaz à savoir Gaz_Min et Gaz_Max. ces </w:t>
+        <w:t xml:space="preserve">.5 on rajoutera une option au menu déroulant permettant de relever et archiver les paramètres de calibration de la pignée de Gaz à savoir </w:t>
+      </w:r>
+      <w:proofErr w:type="spellStart"/>
+      <w:r>
+        <w:t>Gaz_Min</w:t>
+      </w:r>
+      <w:proofErr w:type="spellEnd"/>
+      <w:r>
+        <w:t xml:space="preserve"> et </w:t>
+      </w:r>
+      <w:proofErr w:type="spellStart"/>
+      <w:r>
+        <w:t>Gaz_Max</w:t>
+      </w:r>
+      <w:proofErr w:type="spellEnd"/>
+      <w:r>
+        <w:t xml:space="preserve">. ces </w:t>
       </w:r>
       <w:r>
         <w:t>paramètres</w:t>
@@ -10956,7 +12900,23 @@
         <w:t>calibration</w:t>
       </w:r>
       <w:r>
-        <w:t xml:space="preserve"> de la poignée de gaz et la restauration des paramètres gaz_Min Gaz_Max à chaque démarrage de l’application.</w:t>
+        <w:t xml:space="preserve"> de la poignée de gaz et la restauration des paramètres </w:t>
+      </w:r>
+      <w:proofErr w:type="spellStart"/>
+      <w:r>
+        <w:t>gaz_Min</w:t>
+      </w:r>
+      <w:proofErr w:type="spellEnd"/>
+      <w:r>
+        <w:t xml:space="preserve"> </w:t>
+      </w:r>
+      <w:proofErr w:type="spellStart"/>
+      <w:r>
+        <w:t>Gaz_Max</w:t>
+      </w:r>
+      <w:proofErr w:type="spellEnd"/>
+      <w:r>
+        <w:t xml:space="preserve"> à chaque démarrage de l’application.</w:t>
       </w:r>
     </w:p>
     <w:p>
@@ -10964,8 +12924,14 @@
         <w:pStyle w:val="Titre2"/>
       </w:pPr>
       <w:r>
-        <w:t>Mise en place d’une commande progressive de la REF_PWM à partir de la poignée de  Gaz</w:t>
-      </w:r>
+        <w:lastRenderedPageBreak/>
+        <w:t xml:space="preserve">Mise en place d’une commande progressive de la REF_PWM à partir de la poignée </w:t>
+      </w:r>
+      <w:proofErr w:type="gramStart"/>
+      <w:r>
+        <w:t>de  Gaz</w:t>
+      </w:r>
+      <w:proofErr w:type="gramEnd"/>
       <w:r>
         <w:t>(option)</w:t>
       </w:r>
@@ -10978,7 +12944,15 @@
         <w:t>Pour</w:t>
       </w:r>
       <w:r>
-        <w:t xml:space="preserve"> cela on suppose que si la poignée passe de 0% à 100% la montée de la ref_pwm entre 0 et 255 devra se faire en 1,27s. </w:t>
+        <w:t xml:space="preserve"> cela on suppose que si la poignée passe de 0% à 100% la montée de la </w:t>
+      </w:r>
+      <w:proofErr w:type="spellStart"/>
+      <w:r>
+        <w:t>ref_pwm</w:t>
+      </w:r>
+      <w:proofErr w:type="spellEnd"/>
+      <w:r>
+        <w:t xml:space="preserve"> entre 0 et 255 devra se faire en 1,27s. </w:t>
       </w:r>
       <w:r>
         <w:t>ça</w:t>
@@ -11019,30 +12993,86 @@
     </w:p>
     <w:p>
       <w:r>
-        <w:t xml:space="preserve">Si la consigne Ref_PWM_Brute diminue brusquement, la Ref_PWM_Finale doit la suivre </w:t>
+        <w:t xml:space="preserve">Si la consigne </w:t>
+      </w:r>
+      <w:proofErr w:type="spellStart"/>
+      <w:r>
+        <w:t>Ref_PWM_Brute</w:t>
+      </w:r>
+      <w:proofErr w:type="spellEnd"/>
+      <w:r>
+        <w:t xml:space="preserve"> diminue brusquement, la </w:t>
+      </w:r>
+      <w:proofErr w:type="spellStart"/>
+      <w:r>
+        <w:t>Ref_PWM_Finale</w:t>
+      </w:r>
+      <w:proofErr w:type="spellEnd"/>
+      <w:r>
+        <w:t xml:space="preserve"> doit la suivre </w:t>
       </w:r>
       <w:r>
         <w:t>instantanément</w:t>
       </w:r>
       <w:r>
-        <w:t>. Si au contraire la consigne Ref_PWM_Brute augmente  brusquement alors la REF_PWM_Finale doit remonter progressivement dans le temps.</w:t>
-      </w:r>
+        <w:t xml:space="preserve">. Si au contraire la consigne </w:t>
+      </w:r>
+      <w:proofErr w:type="spellStart"/>
+      <w:r>
+        <w:t>Ref_PWM_Brute</w:t>
+      </w:r>
+      <w:proofErr w:type="spellEnd"/>
       <w:r>
         <w:t xml:space="preserve"> </w:t>
       </w:r>
+      <w:proofErr w:type="gramStart"/>
+      <w:r>
+        <w:t>augmente  brusquement</w:t>
+      </w:r>
+      <w:proofErr w:type="gramEnd"/>
+      <w:r>
+        <w:t xml:space="preserve"> alors la </w:t>
+      </w:r>
+      <w:proofErr w:type="spellStart"/>
+      <w:r>
+        <w:t>REF_PWM_Finale</w:t>
+      </w:r>
+      <w:proofErr w:type="spellEnd"/>
+      <w:r>
+        <w:t xml:space="preserve"> doit remonter progressivement dans le temps.</w:t>
+      </w:r>
+      <w:r>
+        <w:t xml:space="preserve"> </w:t>
+      </w:r>
       <w:r>
         <w:t>On désire toujours couper l’assistance électrique en cas de freinage, mais la remontée de la consigne Finale après un freinage doit être progressive.</w:t>
       </w:r>
     </w:p>
     <w:p>
       <w:r>
-        <w:t xml:space="preserve">Réfléchir et représenter le chronogramme de fonctionnement attendu de cette commande progressive ref_PWM_Final en fonction des variations </w:t>
+        <w:t xml:space="preserve">Réfléchir et représenter le chronogramme de fonctionnement attendu de cette commande progressive </w:t>
+      </w:r>
+      <w:proofErr w:type="spellStart"/>
+      <w:r>
+        <w:t>ref_PWM_Final</w:t>
+      </w:r>
+      <w:proofErr w:type="spellEnd"/>
+      <w:r>
+        <w:t xml:space="preserve"> en fonction des variations </w:t>
       </w:r>
       <w:r>
         <w:t>instantanées</w:t>
       </w:r>
       <w:r>
-        <w:t xml:space="preserve"> de la Ref_PWM_Brute (variation </w:t>
+        <w:t xml:space="preserve"> de la </w:t>
+      </w:r>
+      <w:proofErr w:type="spellStart"/>
+      <w:r>
+        <w:t>Ref_PWM_Brute</w:t>
+      </w:r>
+      <w:proofErr w:type="spellEnd"/>
+      <w:r>
+        <w:t xml:space="preserve"> (variation </w:t>
       </w:r>
       <w:r>
         <w:t>instantanée</w:t>
@@ -11056,12 +13086,28 @@
         <w:pStyle w:val="Titre2"/>
       </w:pPr>
       <w:r>
-        <w:t xml:space="preserve">Affichage du registre interne d’état présent dans le PLD Altera. </w:t>
-      </w:r>
-    </w:p>
-    <w:p>
-      <w:r>
-        <w:t xml:space="preserve">Le PLD altera contient un registre d’état internet sur 8 bits contenant des indicateurs </w:t>
+        <w:t xml:space="preserve">Affichage du registre interne d’état présent dans le PLD </w:t>
+      </w:r>
+      <w:proofErr w:type="spellStart"/>
+      <w:r>
+        <w:t>Altera</w:t>
+      </w:r>
+      <w:proofErr w:type="spellEnd"/>
+      <w:r>
+        <w:t xml:space="preserve">. </w:t>
+      </w:r>
+    </w:p>
+    <w:p>
+      <w:r>
+        <w:t xml:space="preserve">Le PLD </w:t>
+      </w:r>
+      <w:proofErr w:type="spellStart"/>
+      <w:r>
+        <w:t>altera</w:t>
+      </w:r>
+      <w:proofErr w:type="spellEnd"/>
+      <w:r>
+        <w:t xml:space="preserve"> contient un registre d’état internet sur 8 bits contenant des indicateurs </w:t>
       </w:r>
       <w:r>
         <w:t>représentant</w:t>
@@ -11079,7 +13125,23 @@
         </w:numPr>
       </w:pPr>
       <w:r>
-        <w:t xml:space="preserve">Le numéro de secteur d’alimentation actuellement présente dans le moteur brushless (Hall[2..0]) </w:t>
+        <w:t xml:space="preserve">Le numéro de secteur d’alimentation actuellement présente dans le moteur </w:t>
+      </w:r>
+      <w:proofErr w:type="spellStart"/>
+      <w:r>
+        <w:t>brushless</w:t>
+      </w:r>
+      <w:proofErr w:type="spellEnd"/>
+      <w:r>
+        <w:t xml:space="preserve"> (Hall[</w:t>
+      </w:r>
+      <w:proofErr w:type="gramStart"/>
+      <w:r>
+        <w:t>2..</w:t>
+      </w:r>
+      <w:proofErr w:type="gramEnd"/>
+      <w:r>
+        <w:t xml:space="preserve">0]) </w:t>
       </w:r>
     </w:p>
     <w:p>
@@ -11115,8 +13177,13 @@
         </w:numPr>
       </w:pPr>
       <w:r>
-        <w:t>Un indicateur d’appui sur le levier de frein Brake</w:t>
-      </w:r>
+        <w:t xml:space="preserve">Un indicateur d’appui sur le levier de frein </w:t>
+      </w:r>
+      <w:proofErr w:type="spellStart"/>
+      <w:r>
+        <w:t>Brake</w:t>
+      </w:r>
+      <w:proofErr w:type="spellEnd"/>
     </w:p>
     <w:p>
       <w:pPr>
@@ -11133,7 +13200,15 @@
         <w:t>surintensité</w:t>
       </w:r>
       <w:r>
-        <w:t xml:space="preserve"> Over_Current.</w:t>
+        <w:t xml:space="preserve"> </w:t>
+      </w:r>
+      <w:proofErr w:type="spellStart"/>
+      <w:r>
+        <w:t>Over_Current</w:t>
+      </w:r>
+      <w:proofErr w:type="spellEnd"/>
+      <w:r>
+        <w:t>.</w:t>
       </w:r>
     </w:p>
     <w:p>
@@ -11661,7 +13736,23 @@
     <w:p/>
     <w:p>
       <w:r>
-        <w:t>Ce registre d’état peut être lu par le ucMbed au moyen d’une fonction de lecture présente dans l’API fournis et permettant la communication entre le uC et le PLD (plus de détail dans la fiche ressource FICHE 5).</w:t>
+        <w:t xml:space="preserve">Ce registre d’état peut être lu par le </w:t>
+      </w:r>
+      <w:proofErr w:type="spellStart"/>
+      <w:r>
+        <w:t>ucMbed</w:t>
+      </w:r>
+      <w:proofErr w:type="spellEnd"/>
+      <w:r>
+        <w:t xml:space="preserve"> au moyen d’une fonction de lecture présente dans l’API fournis et permettant la communication entre le </w:t>
+      </w:r>
+      <w:proofErr w:type="spellStart"/>
+      <w:r>
+        <w:t>uC</w:t>
+      </w:r>
+      <w:proofErr w:type="spellEnd"/>
+      <w:r>
+        <w:t xml:space="preserve"> et le PLD (plus de détail dans la fiche ressource FICHE 5).</w:t>
       </w:r>
     </w:p>
     <w:p>
@@ -11711,10 +13802,58 @@
         <w:jc w:val="left"/>
       </w:pPr>
       <w:r>
-        <w:t xml:space="preserve">Gere une limitation en vitesse (bride)  réglable depuis la console série et sauvegardée de manière persistante dans le fichier de configuragtion générale du Mbed. Cette limitation en vitesse aura pour objectif de couper instantanément la consigne d’assistance electrique (agissant sur le générateur PWM présent dans le PLD) </w:t>
-      </w:r>
-      <w:r>
-        <w:t>. Il s agit donc de comparer cycliquement (toutes les 100ms par exemple) la vitesse mesurée par le micro controleur à cette valeur de bride en vitesse afin de décider si la consigne d’assistance electrique liée à la poignée de gaz doit être maintenue ou pas.</w:t>
+        <w:t xml:space="preserve">Gere une limitation en vitesse (bride)  réglable depuis la console série et sauvegardée de manière persistante dans le fichier de </w:t>
+      </w:r>
+      <w:proofErr w:type="spellStart"/>
+      <w:r>
+        <w:t>configuragtion</w:t>
+      </w:r>
+      <w:proofErr w:type="spellEnd"/>
+      <w:r>
+        <w:t xml:space="preserve"> générale du </w:t>
+      </w:r>
+      <w:proofErr w:type="spellStart"/>
+      <w:r>
+        <w:t>Mbed</w:t>
+      </w:r>
+      <w:proofErr w:type="spellEnd"/>
+      <w:r>
+        <w:t xml:space="preserve">. Cette limitation en vitesse aura pour objectif de couper instantanément la consigne d’assistance </w:t>
+      </w:r>
+      <w:proofErr w:type="spellStart"/>
+      <w:r>
+        <w:t>electrique</w:t>
+      </w:r>
+      <w:proofErr w:type="spellEnd"/>
+      <w:r>
+        <w:t xml:space="preserve"> (agissant sur le générateur PWM présent dans le PLD) </w:t>
+      </w:r>
+      <w:r>
+        <w:t xml:space="preserve">. Il </w:t>
+      </w:r>
+      <w:proofErr w:type="spellStart"/>
+      <w:r>
+        <w:t>s agit</w:t>
+      </w:r>
+      <w:proofErr w:type="spellEnd"/>
+      <w:r>
+        <w:t xml:space="preserve"> donc de comparer cycliquement (toutes les 100ms par exemple) la vitesse mesurée par le micro </w:t>
+      </w:r>
+      <w:proofErr w:type="spellStart"/>
+      <w:r>
+        <w:t>controleur</w:t>
+      </w:r>
+      <w:proofErr w:type="spellEnd"/>
+      <w:r>
+        <w:t xml:space="preserve"> à cette valeur de bride en vitesse afin de décider si la consigne d’assistance </w:t>
+      </w:r>
+      <w:proofErr w:type="spellStart"/>
+      <w:r>
+        <w:t>electrique</w:t>
+      </w:r>
+      <w:proofErr w:type="spellEnd"/>
+      <w:r>
+        <w:t xml:space="preserve"> liée à la poignée de gaz doit être maintenue ou pas.</w:t>
       </w:r>
     </w:p>
     <w:p/>
@@ -11759,13 +13898,37 @@
         <w:t xml:space="preserve">de serveur http </w:t>
       </w:r>
       <w:r>
-        <w:t xml:space="preserve">du uC </w:t>
+        <w:t xml:space="preserve">du </w:t>
+      </w:r>
+      <w:proofErr w:type="spellStart"/>
+      <w:r>
+        <w:t>uC</w:t>
+      </w:r>
+      <w:proofErr w:type="spellEnd"/>
+      <w:r>
+        <w:t xml:space="preserve"> </w:t>
       </w:r>
       <w:r>
         <w:t xml:space="preserve">MBED </w:t>
       </w:r>
       <w:r>
-        <w:t>afin de collecter des informations temps réel sur le fonctionne de notre contrôleur (vitesse, niveau poignée de gaz, vbat, Ibat, température…) et de l’afficher dans une page web lors de la connexion d’un navigateur client sur notre plateforme.</w:t>
+        <w:t xml:space="preserve">afin de collecter des informations temps réel sur le fonctionne de notre contrôleur (vitesse, niveau poignée de gaz, </w:t>
+      </w:r>
+      <w:proofErr w:type="spellStart"/>
+      <w:r>
+        <w:t>vbat</w:t>
+      </w:r>
+      <w:proofErr w:type="spellEnd"/>
+      <w:r>
+        <w:t xml:space="preserve">, </w:t>
+      </w:r>
+      <w:proofErr w:type="spellStart"/>
+      <w:r>
+        <w:t>Ibat</w:t>
+      </w:r>
+      <w:proofErr w:type="spellEnd"/>
+      <w:r>
+        <w:t>, température…) et de l’afficher dans une page web lors de la connexion d’un navigateur client sur notre plateforme.</w:t>
       </w:r>
     </w:p>
     <w:p>
@@ -11786,7 +13949,65 @@
         <w:t>Cette méthode exploitera le capteur de courante batterie présente dans le contrôleur de puissance.</w:t>
       </w:r>
       <w:r>
-        <w:t xml:space="preserve"> La capacité initiale de batterie (Bat_Nominale) et la capacité restante de batterie (Bat_Restante) seront sauvegardés a la fin de l’application dans le fichier de sauvegarde persistante du Mbed afin de pouvoir être restaurés. Une option du menu déroulant doit permettre de pouvoir fixer la valeur nominale de la capacité batterie (en mA.s) et une option option doit permettre de pouvoir recharger virtuellement à 100% la capacité restante.</w:t>
+        <w:t xml:space="preserve"> La capacité initiale de batterie (</w:t>
+      </w:r>
+      <w:proofErr w:type="spellStart"/>
+      <w:r>
+        <w:t>Bat_Nominale</w:t>
+      </w:r>
+      <w:proofErr w:type="spellEnd"/>
+      <w:r>
+        <w:t>) et la capacité restante de batterie (</w:t>
+      </w:r>
+      <w:proofErr w:type="spellStart"/>
+      <w:r>
+        <w:t>Bat_Restante</w:t>
+      </w:r>
+      <w:proofErr w:type="spellEnd"/>
+      <w:r>
+        <w:t xml:space="preserve">) seront </w:t>
+      </w:r>
+      <w:proofErr w:type="gramStart"/>
+      <w:r>
+        <w:t>sauvegardés</w:t>
+      </w:r>
+      <w:proofErr w:type="gramEnd"/>
+      <w:r>
+        <w:t xml:space="preserve"> </w:t>
+      </w:r>
+      <w:proofErr w:type="spellStart"/>
+      <w:proofErr w:type="gramStart"/>
+      <w:r>
+        <w:t>a</w:t>
+      </w:r>
+      <w:proofErr w:type="spellEnd"/>
+      <w:proofErr w:type="gramEnd"/>
+      <w:r>
+        <w:t xml:space="preserve"> la fin de l’application dans le fichier de sauvegarde persistante du </w:t>
+      </w:r>
+      <w:proofErr w:type="spellStart"/>
+      <w:r>
+        <w:t>Mbed</w:t>
+      </w:r>
+      <w:proofErr w:type="spellEnd"/>
+      <w:r>
+        <w:t xml:space="preserve"> afin de pouvoir être restaurés. Une option du menu déroulant doit permettre de pouvoir fixer la valeur nominale de la capacité batterie (en </w:t>
+      </w:r>
+      <w:proofErr w:type="spellStart"/>
+      <w:r>
+        <w:t>mA.s</w:t>
+      </w:r>
+      <w:proofErr w:type="spellEnd"/>
+      <w:r>
+        <w:t xml:space="preserve">) et une option </w:t>
+      </w:r>
+      <w:proofErr w:type="spellStart"/>
+      <w:r>
+        <w:t>option</w:t>
+      </w:r>
+      <w:proofErr w:type="spellEnd"/>
+      <w:r>
+        <w:t xml:space="preserve"> doit permettre de pouvoir recharger virtuellement à 100% la capacité restante.</w:t>
       </w:r>
     </w:p>
     <w:p>
@@ -11804,10 +14025,26 @@
         <w:jc w:val="left"/>
       </w:pPr>
       <w:r>
-        <w:t xml:space="preserve">Proposer de déporter la gestion de la consigne d’assistance au pédalage  et de freinage via un réseau CAN BUS. La poignée sera alors connectée depuis un 2eme microcontrôleur </w:t>
-      </w:r>
-      <w:r>
-        <w:t xml:space="preserve">MBED (CAN emeteur) </w:t>
+        <w:t xml:space="preserve">Proposer de déporter la gestion de la consigne d’assistance au </w:t>
+      </w:r>
+      <w:proofErr w:type="gramStart"/>
+      <w:r>
+        <w:t>pédalage  et</w:t>
+      </w:r>
+      <w:proofErr w:type="gramEnd"/>
+      <w:r>
+        <w:t xml:space="preserve"> de freinage via un réseau CAN BUS. La poignée sera alors connectée depuis un 2eme microcontrôleur </w:t>
+      </w:r>
+      <w:r>
+        <w:t xml:space="preserve">MBED (CAN </w:t>
+      </w:r>
+      <w:proofErr w:type="spellStart"/>
+      <w:r>
+        <w:t>emeteur</w:t>
+      </w:r>
+      <w:proofErr w:type="spellEnd"/>
+      <w:r>
+        <w:t xml:space="preserve">) </w:t>
       </w:r>
       <w:r>
         <w:t xml:space="preserve">relié en BUS Can au contrôleur de </w:t>
@@ -11819,7 +14056,15 @@
         <w:t>sance</w:t>
       </w:r>
       <w:r>
-        <w:t xml:space="preserve"> (CAN recepteur) afin de </w:t>
+        <w:t xml:space="preserve"> (CAN </w:t>
+      </w:r>
+      <w:proofErr w:type="spellStart"/>
+      <w:r>
+        <w:t>recepteur</w:t>
+      </w:r>
+      <w:proofErr w:type="spellEnd"/>
+      <w:r>
+        <w:t xml:space="preserve">) afin de </w:t>
       </w:r>
       <w:r>
         <w:t>réalis</w:t>
@@ -11828,16 +14073,37 @@
         <w:t xml:space="preserve">er une poignée de gaz </w:t>
       </w:r>
       <w:r>
-        <w:t>d’un communiquant</w:t>
+        <w:t xml:space="preserve">d’un </w:t>
+      </w:r>
+      <w:proofErr w:type="spellStart"/>
+      <w:r>
+        <w:t>communiquant</w:t>
       </w:r>
       <w:r>
         <w:t>e</w:t>
       </w:r>
+      <w:proofErr w:type="spellEnd"/>
       <w:r>
         <w:t>.</w:t>
       </w:r>
       <w:r>
-        <w:t xml:space="preserve"> La calibration et les données persistantes de calibration resteront eux localisés dans le Mbed controleur du VAE, seule l’information brute de consigne de gaz sera déportée via le bus CAN</w:t>
+        <w:t xml:space="preserve"> La calibration et les données persistantes de calibration resteront eux localisés dans le </w:t>
+      </w:r>
+      <w:proofErr w:type="spellStart"/>
+      <w:r>
+        <w:t>Mbed</w:t>
+      </w:r>
+      <w:proofErr w:type="spellEnd"/>
+      <w:r>
+        <w:t xml:space="preserve"> </w:t>
+      </w:r>
+      <w:proofErr w:type="spellStart"/>
+      <w:r>
+        <w:t>controleur</w:t>
+      </w:r>
+      <w:proofErr w:type="spellEnd"/>
+      <w:r>
+        <w:t xml:space="preserve"> du VAE, seule l’information brute de consigne de gaz sera déportée via le bus CAN</w:t>
       </w:r>
     </w:p>
     <w:p>
@@ -12038,8 +14304,13 @@
         </w:numPr>
       </w:pPr>
       <w:r>
-        <w:t>Fiche1 : principe de l’autopilotage par CPLD d’un brushless</w:t>
-      </w:r>
+        <w:t xml:space="preserve">Fiche1 : principe de l’autopilotage par CPLD d’un </w:t>
+      </w:r>
+      <w:proofErr w:type="spellStart"/>
+      <w:r>
+        <w:t>brushless</w:t>
+      </w:r>
+      <w:proofErr w:type="spellEnd"/>
     </w:p>
     <w:p>
       <w:pPr>
@@ -12054,7 +14325,21 @@
           <w:rPr>
             <w:rStyle w:val="Lienhypertexte"/>
           </w:rPr>
-          <w:t>Fiche2 : squelette de projet mbed pour le démarrage du projet</w:t>
+          <w:t xml:space="preserve">Fiche2 : squelette de projet </w:t>
+        </w:r>
+        <w:proofErr w:type="spellStart"/>
+        <w:r>
+          <w:rPr>
+            <w:rStyle w:val="Lienhypertexte"/>
+          </w:rPr>
+          <w:t>mbed</w:t>
+        </w:r>
+        <w:proofErr w:type="spellEnd"/>
+        <w:r>
+          <w:rPr>
+            <w:rStyle w:val="Lienhypertexte"/>
+          </w:rPr>
+          <w:t xml:space="preserve"> pour le démarrage du projet</w:t>
         </w:r>
       </w:hyperlink>
       <w:r>
@@ -12070,7 +14355,15 @@
         </w:numPr>
       </w:pPr>
       <w:r>
-        <w:t xml:space="preserve">Fiche 3 : utilisation d’une classe d E/S permettant la communication entre uC MBED et CPLD </w:t>
+        <w:t xml:space="preserve">Fiche 3 : utilisation d’une classe d E/S permettant la communication entre </w:t>
+      </w:r>
+      <w:proofErr w:type="spellStart"/>
+      <w:r>
+        <w:t>uC</w:t>
+      </w:r>
+      <w:proofErr w:type="spellEnd"/>
+      <w:r>
+        <w:t xml:space="preserve"> MBED et CPLD </w:t>
       </w:r>
     </w:p>
     <w:p>
@@ -12106,6 +14399,7 @@
         </w:numPr>
       </w:pPr>
       <w:r>
+        <w:lastRenderedPageBreak/>
         <w:t>Fiche5 : utilisation d’une bibliothèque permettant la génération d’un page web dynamique</w:t>
       </w:r>
     </w:p>
@@ -12118,7 +14412,15 @@
         </w:numPr>
       </w:pPr>
       <w:r>
-        <w:t>Fiche 6 : utilisation basique d app inventor pour la collecte et l’affichage de données contenues dans une page web</w:t>
+        <w:t xml:space="preserve">Fiche 6 : utilisation basique d app </w:t>
+      </w:r>
+      <w:proofErr w:type="spellStart"/>
+      <w:r>
+        <w:t>inventor</w:t>
+      </w:r>
+      <w:proofErr w:type="spellEnd"/>
+      <w:r>
+        <w:t xml:space="preserve"> pour la collecte et l’affichage de données contenues dans une page web</w:t>
       </w:r>
     </w:p>
     <w:p>
@@ -12218,8 +14520,13 @@
         <w:t xml:space="preserve"> commenté</w:t>
       </w:r>
       <w:r>
-        <w:t xml:space="preserve"> du Mbed</w:t>
-      </w:r>
+        <w:t xml:space="preserve"> du </w:t>
+      </w:r>
+      <w:proofErr w:type="spellStart"/>
+      <w:r>
+        <w:t>Mbed</w:t>
+      </w:r>
+      <w:proofErr w:type="spellEnd"/>
       <w:r>
         <w:t xml:space="preserve"> </w:t>
       </w:r>
@@ -12281,7 +14588,21 @@
         <w:rPr>
           <w:lang w:eastAsia="fr-FR"/>
         </w:rPr>
-        <w:t xml:space="preserve"> Une notice  d’utilisation du menu console atelier (calibration paramétrage) et un manuel d’utilisation grand public. </w:t>
+        <w:t xml:space="preserve"> Une </w:t>
+      </w:r>
+      <w:proofErr w:type="gramStart"/>
+      <w:r>
+        <w:rPr>
+          <w:lang w:eastAsia="fr-FR"/>
+        </w:rPr>
+        <w:t>notice  d’utilisation</w:t>
+      </w:r>
+      <w:proofErr w:type="gramEnd"/>
+      <w:r>
+        <w:rPr>
+          <w:lang w:eastAsia="fr-FR"/>
+        </w:rPr>
+        <w:t xml:space="preserve"> du menu console atelier (calibration paramétrage) et un manuel d’utilisation grand public. </w:t>
       </w:r>
     </w:p>
     <w:p/>
@@ -12358,7 +14679,6 @@
         <w:docPartUnique/>
       </w:docPartObj>
     </w:sdtPr>
-    <w:sdtEndPr/>
     <w:sdtContent>
       <w:p>
         <w:pPr>

</xml_diff>